<commit_message>
Updated the Topic review doc
</commit_message>
<xml_diff>
--- a/GNN_Topic_Brief_Guide_Review.docx
+++ b/GNN_Topic_Brief_Guide_Review.docx
@@ -15,6 +15,20 @@
           <w:szCs w:val="34"/>
         </w:rPr>
         <w:t>GNN Dissertation — Topic Brief</w:t>
+      </w:r>
+    </w:p>
+    <w:p>
+      <w:pPr>
+        <w:spacing w:after="120"/>
+      </w:pPr>
+      <w:r>
+        <w:rPr>
+          <w:i/>
+          <w:iCs/>
+          <w:sz w:val="20"/>
+          <w:szCs w:val="20"/>
+        </w:rPr>
+        <w:t>Updated 29 October 2026, after guide approval on 28 October 2026</w:t>
       </w:r>
     </w:p>
     <w:p>
@@ -27,23 +41,47 @@
         <w:spacing w:before="280" w:after="120"/>
       </w:pPr>
       <w:r>
-        <w:t>1. Proposed topic</w:t>
+        <w:t>1. Approved topic</w:t>
       </w:r>
     </w:p>
     <w:p>
       <w:pPr>
         <w:spacing w:after="120" w:line="276" w:lineRule="auto"/>
+      </w:pPr>
+      <w:r>
         <w:rPr>
           <w:b/>
           <w:bCs/>
         </w:rPr>
-      </w:pPr>
+        <w:t>Question: do brain-GNN explanations find the disease signal, or a scanner-site shortcut?</w:t>
+      </w:r>
+    </w:p>
+    <w:p>
+      <w:pPr>
+        <w:spacing w:after="120" w:line="276" w:lineRule="auto"/>
+      </w:pPr>
+      <w:r>
+        <w:t xml:space="preserve">The guide approved this topic on 28 October 2026. The project is </w:t>
+      </w:r>
       <w:r>
         <w:rPr>
           <w:b/>
           <w:bCs/>
         </w:rPr>
-        <w:t>Question raised: Do brain-GNN explanations find the disease signal, or a scanner-site shortcut?</w:t>
+        <w:t>CXB (Connectome eXplanation Benchmark)</w:t>
+      </w:r>
+      <w:r>
+        <w:t xml:space="preserve">: it plants known connectivity changes and realistic scanner-site artefacts into real, open ABIDE connectomes, so that explanations can be checked against an exact correct answer. The paper also proposes a new method, </w:t>
+      </w:r>
+      <w:r>
+        <w:rPr>
+          <w:b/>
+          <w:bCs/>
+        </w:rPr>
+        <w:t>SiteSwap</w:t>
+      </w:r>
+      <w:r>
+        <w:t>, a GNN trained so its explanation stays the same when a subject's scanner-site signature is swapped.</w:t>
       </w:r>
     </w:p>
     <w:p>
@@ -51,13 +89,14 @@
         <w:spacing w:after="120" w:line="276" w:lineRule="auto"/>
       </w:pPr>
       <w:r>
-        <w:t xml:space="preserve">I </w:t>
-      </w:r>
-      <w:r>
-        <w:t xml:space="preserve">plan to </w:t>
-      </w:r>
-      <w:r>
-        <w:t>propose a benchmark that plants known connectivity changes into real healthy connectomes (open ABIDE data), so explanations can be checked against an exact correct answer, plus a new GNN (working name DecoyGuard) trained to ignore site-like shortcuts.</w:t>
+        <w:rPr>
+          <w:b/>
+          <w:bCs/>
+        </w:rPr>
+        <w:t xml:space="preserve">Guide's decisions: </w:t>
+      </w:r>
+      <w:r>
+        <w:t>a new method is required; the benchmark is accepted as part of the paper; if the method underperforms, it will be optimised rather than dropped.</w:t>
       </w:r>
     </w:p>
     <w:p>
@@ -579,7 +618,7 @@
         <w:t xml:space="preserve">Data risk had to go. </w:t>
       </w:r>
       <w:r>
-        <w:t>ABIDE preprocessed is open, de-identified and needs no access agreement.</w:t>
+        <w:t>ABIDE preprocessed is open, de-identified and needs no access agreement; it is already downloaded and processed.</w:t>
       </w:r>
     </w:p>
     <w:p>
@@ -596,10 +635,10 @@
           <w:b/>
           <w:bCs/>
         </w:rPr>
-        <w:t xml:space="preserve">The field shows the same weakness I saw. </w:t>
-      </w:r>
-      <w:r>
-        <w:t>Recent studies find GNNs often fail to beat simple models on connectome and population-graph data (Han et al. 2025; Mueller et al., TMLR 2024).</w:t>
+        <w:t xml:space="preserve">GNNs often add little accuracy on connectomes. </w:t>
+      </w:r>
+      <w:r>
+        <w:t>Han et al. (npj Artificial Intelligence, 2026) found classical models beat graph models on four large fMRI datasets, and that message passing degrades performance; Mueller et al. (TMLR 2024) found the same for population graphs.</w:t>
       </w:r>
     </w:p>
     <w:p>
@@ -616,10 +655,10 @@
           <w:b/>
           <w:bCs/>
         </w:rPr>
-        <w:t xml:space="preserve">If accuracy gains are doubtful, interpretability claims need testing. </w:t>
-      </w:r>
-      <w:r>
-        <w:t>Brain-GNN papers rely on "interpretable biomarkers", but judge them only by agreement with prior literature.</w:t>
+        <w:t xml:space="preserve">Explanations are never checked against a known answer. </w:t>
+      </w:r>
+      <w:r>
+        <w:t>A 2025 NeuroImage review of 65 brain-GNN studies (Chan et al.) found biomarkers are evaluated mostly by cross-referencing the literature, vary greatly across studies, and lack ground truth; it recommends testing on data with known ground truth.</w:t>
       </w:r>
     </w:p>
     <w:p>
@@ -636,16 +675,10 @@
           <w:b/>
           <w:bCs/>
         </w:rPr>
-        <w:t xml:space="preserve">Gap found. </w:t>
-      </w:r>
-      <w:r>
-        <w:t>No work I found checks brain-GNN explanations against a known correct answer on real connectomes, or tests whether explainers expose site shortcuts. Explainer benchmarks with ground truth (GraphXAI, BAGEL) use synthetic or non-medical graphs; brain benchmarks (BrainGB) measure accuracy only</w:t>
-      </w:r>
-      <w:r>
-        <w:t>,</w:t>
-      </w:r>
-      <w:r>
-        <w:t xml:space="preserve"> site-invariant methods (CIA-GCL, DIR, MetaExplainer) never test whether the selected subgraph is the correct one.</w:t>
+        <w:t xml:space="preserve">The leading interpretable brain GNNs admit the gap. </w:t>
+      </w:r>
+      <w:r>
+        <w:t>CI-GNN (Neural Networks 2024): “Because the ground truth causal subgraph for real-world brain disease datasets are not available, the explanation performance is compared only on the synthetic dataset.” BrainIB (IEEE TNNLS 2025) and BrainOOD (ICLR 2025) judge their subgraphs by agreement with prior findings.</w:t>
       </w:r>
     </w:p>
     <w:p>
@@ -658,7 +691,8 @@
         <w:spacing w:before="280" w:after="120"/>
       </w:pPr>
       <w:r>
-        <w:t>4. Finalised topic and novelty</w:t>
+        <w:lastRenderedPageBreak/>
+        <w:t>4. Novelty and contributions</w:t>
       </w:r>
     </w:p>
     <w:p>
@@ -670,16 +704,10 @@
           <w:b/>
           <w:bCs/>
         </w:rPr>
-        <w:t xml:space="preserve">New question. </w:t>
-      </w:r>
-      <w:r>
-        <w:t xml:space="preserve">When a brain GNN highlights connections, are they the disease signal or a </w:t>
-      </w:r>
-      <w:r>
-        <w:t xml:space="preserve">scanner </w:t>
-      </w:r>
-      <w:r>
-        <w:t>site artefact, and do current explainers reveal which?</w:t>
+        <w:t xml:space="preserve">New benchmark (planted ground truth). </w:t>
+      </w:r>
+      <w:r>
+        <w:t>ABIDE healthy controls are split at random into fake “patients” and “controls”. Known connectivity changes are added to the fake patients, at strong, moderate and weak sizes estimated from real autism-vs-control differences (the design of Beer et al., NeuroImage 2020). Site decoys are built from measured ComBat site effects, fitted on training data only, and correlate with the label in training but not at test.</w:t>
       </w:r>
     </w:p>
     <w:p>
@@ -691,10 +719,10 @@
           <w:b/>
           <w:bCs/>
         </w:rPr>
-        <w:t xml:space="preserve">New benchmark (planted ground truth). </w:t>
-      </w:r>
-      <w:r>
-        <w:t>Randomly split ABIDE healthy controls into fake "patients" and "controls"; inject a known connectivity change into the patients, so the correct explanation is known exactly. Separately inject a decoy site artefact that correlates with the label in training but not at test.</w:t>
+        <w:t xml:space="preserve">New method (SiteSwap). </w:t>
+      </w:r>
+      <w:r>
+        <w:t>Each subject gets counterfactual copies with another site's measured scanner signature. A GNN with a built-in edge mask (as in GSAT, ICML 2022), a Yeo-7 network-level prior and a site-adversarial head is trained so its prediction and explanation stay the same across those copies.</w:t>
       </w:r>
     </w:p>
     <w:p>
@@ -706,10 +734,59 @@
           <w:b/>
           <w:bCs/>
         </w:rPr>
-        <w:t xml:space="preserve">New method (DecoyGuard). </w:t>
-      </w:r>
-      <w:r>
-        <w:t>Reuses the planting code during training: random decoys are added at known edges and a loss penalises explanation weight on them. Built on a GCN/GIN encoder with a learnable edge mask, a Yeo-7 network-level sparsity prior and a site-adversarial head.</w:t>
+        <w:t>Contributions</w:t>
+      </w:r>
+    </w:p>
+    <w:p>
+      <w:pPr>
+        <w:pStyle w:val="ListParagraph"/>
+        <w:numPr>
+          <w:ilvl w:val="0"/>
+          <w:numId w:val="3"/>
+        </w:numPr>
+        <w:spacing w:after="60" w:line="264" w:lineRule="auto"/>
+      </w:pPr>
+      <w:r>
+        <w:t>C1. The first explanation benchmark with known correct answers on real connectomes, with realistic site decoys.</w:t>
+      </w:r>
+    </w:p>
+    <w:p>
+      <w:pPr>
+        <w:pStyle w:val="ListParagraph"/>
+        <w:numPr>
+          <w:ilvl w:val="0"/>
+          <w:numId w:val="3"/>
+        </w:numPr>
+        <w:spacing w:after="60" w:line="264" w:lineRule="auto"/>
+      </w:pPr>
+      <w:r>
+        <w:t>C2. The first ground-truth test of shortcut-robust brain GNNs (BrainIB, CI-GNN, BrainOOD).</w:t>
+      </w:r>
+    </w:p>
+    <w:p>
+      <w:pPr>
+        <w:pStyle w:val="ListParagraph"/>
+        <w:numPr>
+          <w:ilvl w:val="0"/>
+          <w:numId w:val="3"/>
+        </w:numPr>
+        <w:spacing w:after="60" w:line="264" w:lineRule="auto"/>
+      </w:pPr>
+      <w:r>
+        <w:t>C3. A comparison of GNN explanations with simple-model explanations (logistic regression, random forest, MLP).</w:t>
+      </w:r>
+    </w:p>
+    <w:p>
+      <w:pPr>
+        <w:pStyle w:val="ListParagraph"/>
+        <w:numPr>
+          <w:ilvl w:val="0"/>
+          <w:numId w:val="3"/>
+        </w:numPr>
+        <w:spacing w:after="60" w:line="264" w:lineRule="auto"/>
+      </w:pPr>
+      <w:r>
+        <w:t>C4. SiteSwap, with an ablation of each component.</w:t>
       </w:r>
     </w:p>
     <w:p>
@@ -721,11 +798,10 @@
           <w:b/>
           <w:bCs/>
         </w:rPr>
-        <w:lastRenderedPageBreak/>
         <w:t xml:space="preserve">Evaluation: </w:t>
       </w:r>
       <w:r>
-        <w:t>AUPRC of planted-edge recovery (primary); fidelity, stability, decoy exposure and AUC (secondary). Compared against GCN, GAT, GIN, BrainGNN, a graph transformer and non-graph baselines (MLP, LR, RF); six explainers; random 5-fold and leave-site-out splits; 5 seeds × 5 folds with bootstrap CIs.</w:t>
+        <w:t>primary metric is AUPRC of planted-edge recovery; secondary metrics are fidelity, stability across seeds, share of explanation on decoy edges, and classification AUC. Subject-level inductive splits, random 5-fold and leave-one-site-out, 5 seeds, paired significance tests. A shuffled-label control (Jeon, J. Cheminformatics 2026) checks that explanation agreement is not explainer bias.</w:t>
       </w:r>
     </w:p>
     <w:p>
@@ -737,24 +813,10 @@
           <w:b/>
           <w:bCs/>
         </w:rPr>
-        <w:t xml:space="preserve">Novelty </w:t>
-      </w:r>
-      <w:r>
-        <w:rPr>
-          <w:b/>
-          <w:bCs/>
-        </w:rPr>
-        <w:t>score estimate</w:t>
-      </w:r>
-      <w:r>
-        <w:rPr>
-          <w:b/>
-          <w:bCs/>
-        </w:rPr>
-        <w:t xml:space="preserve">: </w:t>
-      </w:r>
-      <w:r>
-        <w:t>question and benchmark ~8/10; method alone ~6.5–7/10 (invariant-subgraph GNNs exist); combined ~8/10. To be re-checked against forward citations of GraphXAI, BrainGB, CI-GNN and BAGEL before writing.</w:t>
+        <w:t xml:space="preserve">Novelty estimate: </w:t>
+      </w:r>
+      <w:r>
+        <w:t>C1–C2 about 8/10; SiteSwap about 6.5/10; overall about 8/10.</w:t>
       </w:r>
     </w:p>
     <w:p>
@@ -767,7 +829,7 @@
         <w:spacing w:before="280" w:after="120"/>
       </w:pPr>
       <w:r>
-        <w:t>5. Data</w:t>
+        <w:t>5. Novelty verification</w:t>
       </w:r>
     </w:p>
     <w:p>
@@ -775,7 +837,656 @@
         <w:spacing w:after="120" w:line="276" w:lineRule="auto"/>
       </w:pPr>
       <w:r>
-        <w:t>The data is fully open and de-identified. It can be downloaded today with no access agreement, which fixes the problem that stopped my earlier directions.</w:t>
+        <w:t>Checked with seven Consensus searches (28 October 2026), a 2026-only search for new peer-reviewed work, and full-text reading of 11 papers. Preprints were noted but are not cited.</w:t>
+      </w:r>
+    </w:p>
+    <w:tbl>
+      <w:tblPr>
+        <w:tblW w:w="9026" w:type="dxa"/>
+        <w:tblBorders>
+          <w:top w:val="single" w:sz="4" w:space="0" w:color="auto"/>
+          <w:left w:val="single" w:sz="4" w:space="0" w:color="auto"/>
+          <w:bottom w:val="single" w:sz="4" w:space="0" w:color="auto"/>
+          <w:right w:val="single" w:sz="4" w:space="0" w:color="auto"/>
+          <w:insideH w:val="single" w:sz="4" w:space="0" w:color="auto"/>
+          <w:insideV w:val="single" w:sz="4" w:space="0" w:color="auto"/>
+        </w:tblBorders>
+        <w:tblCellMar>
+          <w:left w:w="10" w:type="dxa"/>
+          <w:right w:w="10" w:type="dxa"/>
+        </w:tblCellMar>
+        <w:tblLook w:val="0000" w:firstRow="0" w:lastRow="0" w:firstColumn="0" w:lastColumn="0" w:noHBand="0" w:noVBand="0"/>
+      </w:tblPr>
+      <w:tblGrid>
+        <w:gridCol w:w="2600"/>
+        <w:gridCol w:w="3100"/>
+        <w:gridCol w:w="3326"/>
+      </w:tblGrid>
+      <w:tr>
+        <w:trPr>
+          <w:cantSplit/>
+          <w:tblHeader/>
+        </w:trPr>
+        <w:tc>
+          <w:tcPr>
+            <w:tcW w:w="2600" w:type="dxa"/>
+            <w:tcBorders>
+              <w:top w:val="single" w:sz="4" w:space="0" w:color="BFBFBF"/>
+              <w:left w:val="single" w:sz="4" w:space="0" w:color="BFBFBF"/>
+              <w:bottom w:val="single" w:sz="4" w:space="0" w:color="BFBFBF"/>
+              <w:right w:val="single" w:sz="4" w:space="0" w:color="BFBFBF"/>
+            </w:tcBorders>
+            <w:shd w:val="clear" w:color="auto" w:fill="DCE6F1"/>
+            <w:tcMar>
+              <w:top w:w="60" w:type="dxa"/>
+              <w:left w:w="100" w:type="dxa"/>
+              <w:bottom w:w="60" w:type="dxa"/>
+              <w:right w:w="100" w:type="dxa"/>
+            </w:tcMar>
+          </w:tcPr>
+          <w:p>
+            <w:r>
+              <w:rPr>
+                <w:b/>
+                <w:bCs/>
+                <w:sz w:val="19"/>
+                <w:szCs w:val="19"/>
+              </w:rPr>
+              <w:t>Claim</w:t>
+            </w:r>
+          </w:p>
+        </w:tc>
+        <w:tc>
+          <w:tcPr>
+            <w:tcW w:w="3100" w:type="dxa"/>
+            <w:tcBorders>
+              <w:top w:val="single" w:sz="4" w:space="0" w:color="BFBFBF"/>
+              <w:left w:val="single" w:sz="4" w:space="0" w:color="BFBFBF"/>
+              <w:bottom w:val="single" w:sz="4" w:space="0" w:color="BFBFBF"/>
+              <w:right w:val="single" w:sz="4" w:space="0" w:color="BFBFBF"/>
+            </w:tcBorders>
+            <w:shd w:val="clear" w:color="auto" w:fill="DCE6F1"/>
+            <w:tcMar>
+              <w:top w:w="60" w:type="dxa"/>
+              <w:left w:w="100" w:type="dxa"/>
+              <w:bottom w:w="60" w:type="dxa"/>
+              <w:right w:w="100" w:type="dxa"/>
+            </w:tcMar>
+          </w:tcPr>
+          <w:p>
+            <w:r>
+              <w:rPr>
+                <w:b/>
+                <w:bCs/>
+                <w:sz w:val="19"/>
+                <w:szCs w:val="19"/>
+              </w:rPr>
+              <w:t>Closest work</w:t>
+            </w:r>
+          </w:p>
+        </w:tc>
+        <w:tc>
+          <w:tcPr>
+            <w:tcW w:w="3326" w:type="dxa"/>
+            <w:tcBorders>
+              <w:top w:val="single" w:sz="4" w:space="0" w:color="BFBFBF"/>
+              <w:left w:val="single" w:sz="4" w:space="0" w:color="BFBFBF"/>
+              <w:bottom w:val="single" w:sz="4" w:space="0" w:color="BFBFBF"/>
+              <w:right w:val="single" w:sz="4" w:space="0" w:color="BFBFBF"/>
+            </w:tcBorders>
+            <w:shd w:val="clear" w:color="auto" w:fill="DCE6F1"/>
+            <w:tcMar>
+              <w:top w:w="60" w:type="dxa"/>
+              <w:left w:w="100" w:type="dxa"/>
+              <w:bottom w:w="60" w:type="dxa"/>
+              <w:right w:w="100" w:type="dxa"/>
+            </w:tcMar>
+          </w:tcPr>
+          <w:p>
+            <w:r>
+              <w:rPr>
+                <w:b/>
+                <w:bCs/>
+                <w:sz w:val="19"/>
+                <w:szCs w:val="19"/>
+              </w:rPr>
+              <w:t>Result</w:t>
+            </w:r>
+          </w:p>
+        </w:tc>
+      </w:tr>
+      <w:tr>
+        <w:trPr>
+          <w:cantSplit/>
+        </w:trPr>
+        <w:tc>
+          <w:tcPr>
+            <w:tcW w:w="2600" w:type="dxa"/>
+            <w:tcBorders>
+              <w:top w:val="single" w:sz="4" w:space="0" w:color="BFBFBF"/>
+              <w:left w:val="single" w:sz="4" w:space="0" w:color="BFBFBF"/>
+              <w:bottom w:val="single" w:sz="4" w:space="0" w:color="BFBFBF"/>
+              <w:right w:val="single" w:sz="4" w:space="0" w:color="BFBFBF"/>
+            </w:tcBorders>
+            <w:tcMar>
+              <w:top w:w="60" w:type="dxa"/>
+              <w:left w:w="100" w:type="dxa"/>
+              <w:bottom w:w="60" w:type="dxa"/>
+              <w:right w:w="100" w:type="dxa"/>
+            </w:tcMar>
+          </w:tcPr>
+          <w:p>
+            <w:r>
+              <w:rPr>
+                <w:b/>
+                <w:bCs/>
+                <w:sz w:val="19"/>
+                <w:szCs w:val="19"/>
+              </w:rPr>
+              <w:t>Planted effects in real connectomes to test GNN explanations</w:t>
+            </w:r>
+          </w:p>
+        </w:tc>
+        <w:tc>
+          <w:tcPr>
+            <w:tcW w:w="3100" w:type="dxa"/>
+            <w:tcBorders>
+              <w:top w:val="single" w:sz="4" w:space="0" w:color="BFBFBF"/>
+              <w:left w:val="single" w:sz="4" w:space="0" w:color="BFBFBF"/>
+              <w:bottom w:val="single" w:sz="4" w:space="0" w:color="BFBFBF"/>
+              <w:right w:val="single" w:sz="4" w:space="0" w:color="BFBFBF"/>
+            </w:tcBorders>
+            <w:tcMar>
+              <w:top w:w="60" w:type="dxa"/>
+              <w:left w:w="100" w:type="dxa"/>
+              <w:bottom w:w="60" w:type="dxa"/>
+              <w:right w:w="100" w:type="dxa"/>
+            </w:tcMar>
+          </w:tcPr>
+          <w:p>
+            <w:r>
+              <w:rPr>
+                <w:sz w:val="19"/>
+                <w:szCs w:val="19"/>
+              </w:rPr>
+              <w:t>GraphXAI (Sci Data 2023), BA-2Motif in CI-GNN: synthetic graphs only</w:t>
+            </w:r>
+          </w:p>
+        </w:tc>
+        <w:tc>
+          <w:tcPr>
+            <w:tcW w:w="3326" w:type="dxa"/>
+            <w:tcBorders>
+              <w:top w:val="single" w:sz="4" w:space="0" w:color="BFBFBF"/>
+              <w:left w:val="single" w:sz="4" w:space="0" w:color="BFBFBF"/>
+              <w:bottom w:val="single" w:sz="4" w:space="0" w:color="BFBFBF"/>
+              <w:right w:val="single" w:sz="4" w:space="0" w:color="BFBFBF"/>
+            </w:tcBorders>
+            <w:tcMar>
+              <w:top w:w="60" w:type="dxa"/>
+              <w:left w:w="100" w:type="dxa"/>
+              <w:bottom w:w="60" w:type="dxa"/>
+              <w:right w:w="100" w:type="dxa"/>
+            </w:tcMar>
+          </w:tcPr>
+          <w:p>
+            <w:r>
+              <w:rPr>
+                <w:sz w:val="19"/>
+                <w:szCs w:val="19"/>
+              </w:rPr>
+              <w:t>Open. No paper does this on real connectomes</w:t>
+            </w:r>
+          </w:p>
+        </w:tc>
+      </w:tr>
+      <w:tr>
+        <w:trPr>
+          <w:cantSplit/>
+        </w:trPr>
+        <w:tc>
+          <w:tcPr>
+            <w:tcW w:w="2600" w:type="dxa"/>
+            <w:tcBorders>
+              <w:top w:val="single" w:sz="4" w:space="0" w:color="BFBFBF"/>
+              <w:left w:val="single" w:sz="4" w:space="0" w:color="BFBFBF"/>
+              <w:bottom w:val="single" w:sz="4" w:space="0" w:color="BFBFBF"/>
+              <w:right w:val="single" w:sz="4" w:space="0" w:color="BFBFBF"/>
+            </w:tcBorders>
+            <w:tcMar>
+              <w:top w:w="60" w:type="dxa"/>
+              <w:left w:w="100" w:type="dxa"/>
+              <w:bottom w:w="60" w:type="dxa"/>
+              <w:right w:w="100" w:type="dxa"/>
+            </w:tcMar>
+          </w:tcPr>
+          <w:p>
+            <w:r>
+              <w:rPr>
+                <w:b/>
+                <w:bCs/>
+                <w:sz w:val="19"/>
+                <w:szCs w:val="19"/>
+              </w:rPr>
+              <w:t>Planting effects into real data</w:t>
+            </w:r>
+          </w:p>
+        </w:tc>
+        <w:tc>
+          <w:tcPr>
+            <w:tcW w:w="3100" w:type="dxa"/>
+            <w:tcBorders>
+              <w:top w:val="single" w:sz="4" w:space="0" w:color="BFBFBF"/>
+              <w:left w:val="single" w:sz="4" w:space="0" w:color="BFBFBF"/>
+              <w:bottom w:val="single" w:sz="4" w:space="0" w:color="BFBFBF"/>
+              <w:right w:val="single" w:sz="4" w:space="0" w:color="BFBFBF"/>
+            </w:tcBorders>
+            <w:tcMar>
+              <w:top w:w="60" w:type="dxa"/>
+              <w:left w:w="100" w:type="dxa"/>
+              <w:bottom w:w="60" w:type="dxa"/>
+              <w:right w:w="100" w:type="dxa"/>
+            </w:tcMar>
+          </w:tcPr>
+          <w:p>
+            <w:r>
+              <w:rPr>
+                <w:sz w:val="19"/>
+                <w:szCs w:val="19"/>
+              </w:rPr>
+              <w:t>Beer et al. 2020; Reynolds et al. 2023 (harmonisation studies)</w:t>
+            </w:r>
+          </w:p>
+        </w:tc>
+        <w:tc>
+          <w:tcPr>
+            <w:tcW w:w="3326" w:type="dxa"/>
+            <w:tcBorders>
+              <w:top w:val="single" w:sz="4" w:space="0" w:color="BFBFBF"/>
+              <w:left w:val="single" w:sz="4" w:space="0" w:color="BFBFBF"/>
+              <w:bottom w:val="single" w:sz="4" w:space="0" w:color="BFBFBF"/>
+              <w:right w:val="single" w:sz="4" w:space="0" w:color="BFBFBF"/>
+            </w:tcBorders>
+            <w:tcMar>
+              <w:top w:w="60" w:type="dxa"/>
+              <w:left w:w="100" w:type="dxa"/>
+              <w:bottom w:w="60" w:type="dxa"/>
+              <w:right w:w="100" w:type="dxa"/>
+            </w:tcMar>
+          </w:tcPr>
+          <w:p>
+            <w:r>
+              <w:rPr>
+                <w:sz w:val="19"/>
+                <w:szCs w:val="19"/>
+              </w:rPr>
+              <w:t>Done before, but not for ML explanations. Claim is “first for GNN explanations”, and these papers defend the design</w:t>
+            </w:r>
+          </w:p>
+        </w:tc>
+      </w:tr>
+      <w:tr>
+        <w:trPr>
+          <w:cantSplit/>
+        </w:trPr>
+        <w:tc>
+          <w:tcPr>
+            <w:tcW w:w="2600" w:type="dxa"/>
+            <w:tcBorders>
+              <w:top w:val="single" w:sz="4" w:space="0" w:color="BFBFBF"/>
+              <w:left w:val="single" w:sz="4" w:space="0" w:color="BFBFBF"/>
+              <w:bottom w:val="single" w:sz="4" w:space="0" w:color="BFBFBF"/>
+              <w:right w:val="single" w:sz="4" w:space="0" w:color="BFBFBF"/>
+            </w:tcBorders>
+            <w:tcMar>
+              <w:top w:w="60" w:type="dxa"/>
+              <w:left w:w="100" w:type="dxa"/>
+              <w:bottom w:w="60" w:type="dxa"/>
+              <w:right w:w="100" w:type="dxa"/>
+            </w:tcMar>
+          </w:tcPr>
+          <w:p>
+            <w:r>
+              <w:rPr>
+                <w:b/>
+                <w:bCs/>
+                <w:sz w:val="19"/>
+                <w:szCs w:val="19"/>
+              </w:rPr>
+              <w:t>Ground-truth test of shortcut-robust brain GNNs</w:t>
+            </w:r>
+          </w:p>
+        </w:tc>
+        <w:tc>
+          <w:tcPr>
+            <w:tcW w:w="3100" w:type="dxa"/>
+            <w:tcBorders>
+              <w:top w:val="single" w:sz="4" w:space="0" w:color="BFBFBF"/>
+              <w:left w:val="single" w:sz="4" w:space="0" w:color="BFBFBF"/>
+              <w:bottom w:val="single" w:sz="4" w:space="0" w:color="BFBFBF"/>
+              <w:right w:val="single" w:sz="4" w:space="0" w:color="BFBFBF"/>
+            </w:tcBorders>
+            <w:tcMar>
+              <w:top w:w="60" w:type="dxa"/>
+              <w:left w:w="100" w:type="dxa"/>
+              <w:bottom w:w="60" w:type="dxa"/>
+              <w:right w:w="100" w:type="dxa"/>
+            </w:tcMar>
+          </w:tcPr>
+          <w:p>
+            <w:r>
+              <w:rPr>
+                <w:sz w:val="19"/>
+                <w:szCs w:val="19"/>
+              </w:rPr>
+              <w:t>BrainIB, CI-GNN, BrainOOD, MetaExplainer</w:t>
+            </w:r>
+          </w:p>
+        </w:tc>
+        <w:tc>
+          <w:tcPr>
+            <w:tcW w:w="3326" w:type="dxa"/>
+            <w:tcBorders>
+              <w:top w:val="single" w:sz="4" w:space="0" w:color="BFBFBF"/>
+              <w:left w:val="single" w:sz="4" w:space="0" w:color="BFBFBF"/>
+              <w:bottom w:val="single" w:sz="4" w:space="0" w:color="BFBFBF"/>
+              <w:right w:val="single" w:sz="4" w:space="0" w:color="BFBFBF"/>
+            </w:tcBorders>
+            <w:tcMar>
+              <w:top w:w="60" w:type="dxa"/>
+              <w:left w:w="100" w:type="dxa"/>
+              <w:bottom w:w="60" w:type="dxa"/>
+              <w:right w:w="100" w:type="dxa"/>
+            </w:tcMar>
+          </w:tcPr>
+          <w:p>
+            <w:r>
+              <w:rPr>
+                <w:sz w:val="19"/>
+                <w:szCs w:val="19"/>
+              </w:rPr>
+              <w:t>Open. All validate against literature</w:t>
+            </w:r>
+          </w:p>
+        </w:tc>
+      </w:tr>
+      <w:tr>
+        <w:trPr>
+          <w:cantSplit/>
+        </w:trPr>
+        <w:tc>
+          <w:tcPr>
+            <w:tcW w:w="2600" w:type="dxa"/>
+            <w:tcBorders>
+              <w:top w:val="single" w:sz="4" w:space="0" w:color="BFBFBF"/>
+              <w:left w:val="single" w:sz="4" w:space="0" w:color="BFBFBF"/>
+              <w:bottom w:val="single" w:sz="4" w:space="0" w:color="BFBFBF"/>
+              <w:right w:val="single" w:sz="4" w:space="0" w:color="BFBFBF"/>
+            </w:tcBorders>
+            <w:tcMar>
+              <w:top w:w="60" w:type="dxa"/>
+              <w:left w:w="100" w:type="dxa"/>
+              <w:bottom w:w="60" w:type="dxa"/>
+              <w:right w:w="100" w:type="dxa"/>
+            </w:tcMar>
+          </w:tcPr>
+          <w:p>
+            <w:r>
+              <w:rPr>
+                <w:b/>
+                <w:bCs/>
+                <w:sz w:val="19"/>
+                <w:szCs w:val="19"/>
+              </w:rPr>
+              <w:t>Site decoys from measured ComBat effects</w:t>
+            </w:r>
+          </w:p>
+        </w:tc>
+        <w:tc>
+          <w:tcPr>
+            <w:tcW w:w="3100" w:type="dxa"/>
+            <w:tcBorders>
+              <w:top w:val="single" w:sz="4" w:space="0" w:color="BFBFBF"/>
+              <w:left w:val="single" w:sz="4" w:space="0" w:color="BFBFBF"/>
+              <w:bottom w:val="single" w:sz="4" w:space="0" w:color="BFBFBF"/>
+              <w:right w:val="single" w:sz="4" w:space="0" w:color="BFBFBF"/>
+            </w:tcBorders>
+            <w:tcMar>
+              <w:top w:w="60" w:type="dxa"/>
+              <w:left w:w="100" w:type="dxa"/>
+              <w:bottom w:w="60" w:type="dxa"/>
+              <w:right w:w="100" w:type="dxa"/>
+            </w:tcMar>
+          </w:tcPr>
+          <w:p>
+            <w:r>
+              <w:rPr>
+                <w:sz w:val="19"/>
+                <w:szCs w:val="19"/>
+              </w:rPr>
+              <w:t>Fully Bayesian ComBat for augmentation (Reynolds 2023)</w:t>
+            </w:r>
+          </w:p>
+        </w:tc>
+        <w:tc>
+          <w:tcPr>
+            <w:tcW w:w="3326" w:type="dxa"/>
+            <w:tcBorders>
+              <w:top w:val="single" w:sz="4" w:space="0" w:color="BFBFBF"/>
+              <w:left w:val="single" w:sz="4" w:space="0" w:color="BFBFBF"/>
+              <w:bottom w:val="single" w:sz="4" w:space="0" w:color="BFBFBF"/>
+              <w:right w:val="single" w:sz="4" w:space="0" w:color="BFBFBF"/>
+            </w:tcBorders>
+            <w:tcMar>
+              <w:top w:w="60" w:type="dxa"/>
+              <w:left w:w="100" w:type="dxa"/>
+              <w:bottom w:w="60" w:type="dxa"/>
+              <w:right w:w="100" w:type="dxa"/>
+            </w:tcMar>
+          </w:tcPr>
+          <w:p>
+            <w:r>
+              <w:rPr>
+                <w:sz w:val="19"/>
+                <w:szCs w:val="19"/>
+              </w:rPr>
+              <w:t>Generator has precedent; use for explanation decoys is new</w:t>
+            </w:r>
+          </w:p>
+        </w:tc>
+      </w:tr>
+      <w:tr>
+        <w:trPr>
+          <w:cantSplit/>
+        </w:trPr>
+        <w:tc>
+          <w:tcPr>
+            <w:tcW w:w="2600" w:type="dxa"/>
+            <w:tcBorders>
+              <w:top w:val="single" w:sz="4" w:space="0" w:color="BFBFBF"/>
+              <w:left w:val="single" w:sz="4" w:space="0" w:color="BFBFBF"/>
+              <w:bottom w:val="single" w:sz="4" w:space="0" w:color="BFBFBF"/>
+              <w:right w:val="single" w:sz="4" w:space="0" w:color="BFBFBF"/>
+            </w:tcBorders>
+            <w:tcMar>
+              <w:top w:w="60" w:type="dxa"/>
+              <w:left w:w="100" w:type="dxa"/>
+              <w:bottom w:w="60" w:type="dxa"/>
+              <w:right w:w="100" w:type="dxa"/>
+            </w:tcMar>
+          </w:tcPr>
+          <w:p>
+            <w:r>
+              <w:rPr>
+                <w:b/>
+                <w:bCs/>
+                <w:sz w:val="19"/>
+                <w:szCs w:val="19"/>
+              </w:rPr>
+              <w:t>SiteSwap training</w:t>
+            </w:r>
+          </w:p>
+        </w:tc>
+        <w:tc>
+          <w:tcPr>
+            <w:tcW w:w="3100" w:type="dxa"/>
+            <w:tcBorders>
+              <w:top w:val="single" w:sz="4" w:space="0" w:color="BFBFBF"/>
+              <w:left w:val="single" w:sz="4" w:space="0" w:color="BFBFBF"/>
+              <w:bottom w:val="single" w:sz="4" w:space="0" w:color="BFBFBF"/>
+              <w:right w:val="single" w:sz="4" w:space="0" w:color="BFBFBF"/>
+            </w:tcBorders>
+            <w:tcMar>
+              <w:top w:w="60" w:type="dxa"/>
+              <w:left w:w="100" w:type="dxa"/>
+              <w:bottom w:w="60" w:type="dxa"/>
+              <w:right w:w="100" w:type="dxa"/>
+            </w:tcMar>
+          </w:tcPr>
+          <w:p>
+            <w:r>
+              <w:rPr>
+                <w:sz w:val="19"/>
+                <w:szCs w:val="19"/>
+              </w:rPr>
+              <w:t>RGDA (ACM TKDD 2024), CAL (KDD 2022)</w:t>
+            </w:r>
+          </w:p>
+        </w:tc>
+        <w:tc>
+          <w:tcPr>
+            <w:tcW w:w="3326" w:type="dxa"/>
+            <w:tcBorders>
+              <w:top w:val="single" w:sz="4" w:space="0" w:color="BFBFBF"/>
+              <w:left w:val="single" w:sz="4" w:space="0" w:color="BFBFBF"/>
+              <w:bottom w:val="single" w:sz="4" w:space="0" w:color="BFBFBF"/>
+              <w:right w:val="single" w:sz="4" w:space="0" w:color="BFBFBF"/>
+            </w:tcBorders>
+            <w:tcMar>
+              <w:top w:w="60" w:type="dxa"/>
+              <w:left w:w="100" w:type="dxa"/>
+              <w:bottom w:w="60" w:type="dxa"/>
+              <w:right w:w="100" w:type="dxa"/>
+            </w:tcMar>
+          </w:tcPr>
+          <w:p>
+            <w:r>
+              <w:rPr>
+                <w:sz w:val="19"/>
+                <w:szCs w:val="19"/>
+              </w:rPr>
+              <w:t>Partly new: environment swapping exists for general graphs, not with measured site effects</w:t>
+            </w:r>
+          </w:p>
+        </w:tc>
+      </w:tr>
+      <w:tr>
+        <w:trPr>
+          <w:cantSplit/>
+        </w:trPr>
+        <w:tc>
+          <w:tcPr>
+            <w:tcW w:w="2600" w:type="dxa"/>
+            <w:tcBorders>
+              <w:top w:val="single" w:sz="4" w:space="0" w:color="BFBFBF"/>
+              <w:left w:val="single" w:sz="4" w:space="0" w:color="BFBFBF"/>
+              <w:bottom w:val="single" w:sz="4" w:space="0" w:color="BFBFBF"/>
+              <w:right w:val="single" w:sz="4" w:space="0" w:color="BFBFBF"/>
+            </w:tcBorders>
+            <w:tcMar>
+              <w:top w:w="60" w:type="dxa"/>
+              <w:left w:w="100" w:type="dxa"/>
+              <w:bottom w:w="60" w:type="dxa"/>
+              <w:right w:w="100" w:type="dxa"/>
+            </w:tcMar>
+          </w:tcPr>
+          <w:p>
+            <w:r>
+              <w:rPr>
+                <w:b/>
+                <w:bCs/>
+                <w:sz w:val="19"/>
+                <w:szCs w:val="19"/>
+              </w:rPr>
+              <w:t>Newest work (2026)</w:t>
+            </w:r>
+          </w:p>
+        </w:tc>
+        <w:tc>
+          <w:tcPr>
+            <w:tcW w:w="3100" w:type="dxa"/>
+            <w:tcBorders>
+              <w:top w:val="single" w:sz="4" w:space="0" w:color="BFBFBF"/>
+              <w:left w:val="single" w:sz="4" w:space="0" w:color="BFBFBF"/>
+              <w:bottom w:val="single" w:sz="4" w:space="0" w:color="BFBFBF"/>
+              <w:right w:val="single" w:sz="4" w:space="0" w:color="BFBFBF"/>
+            </w:tcBorders>
+            <w:tcMar>
+              <w:top w:w="60" w:type="dxa"/>
+              <w:left w:w="100" w:type="dxa"/>
+              <w:bottom w:w="60" w:type="dxa"/>
+              <w:right w:w="100" w:type="dxa"/>
+            </w:tcMar>
+          </w:tcPr>
+          <w:p>
+            <w:r>
+              <w:rPr>
+                <w:sz w:val="19"/>
+                <w:szCs w:val="19"/>
+              </w:rPr>
+              <w:t>14 peer-reviewed papers, e.g. BrainIB++, OAR (IEEE TPAMI), SLACC</w:t>
+            </w:r>
+          </w:p>
+        </w:tc>
+        <w:tc>
+          <w:tcPr>
+            <w:tcW w:w="3326" w:type="dxa"/>
+            <w:tcBorders>
+              <w:top w:val="single" w:sz="4" w:space="0" w:color="BFBFBF"/>
+              <w:left w:val="single" w:sz="4" w:space="0" w:color="BFBFBF"/>
+              <w:bottom w:val="single" w:sz="4" w:space="0" w:color="BFBFBF"/>
+              <w:right w:val="single" w:sz="4" w:space="0" w:color="BFBFBF"/>
+            </w:tcBorders>
+            <w:tcMar>
+              <w:top w:w="60" w:type="dxa"/>
+              <w:left w:w="100" w:type="dxa"/>
+              <w:bottom w:w="60" w:type="dxa"/>
+              <w:right w:w="100" w:type="dxa"/>
+            </w:tcMar>
+          </w:tcPr>
+          <w:p>
+            <w:r>
+              <w:rPr>
+                <w:sz w:val="19"/>
+                <w:szCs w:val="19"/>
+              </w:rPr>
+              <w:t>None closes the gap</w:t>
+            </w:r>
+          </w:p>
+        </w:tc>
+      </w:tr>
+    </w:tbl>
+    <w:p/>
+    <w:p>
+      <w:pPr>
+        <w:pStyle w:val="Heading1"/>
+        <w:keepNext/>
+        <w:pBdr>
+          <w:bottom w:val="single" w:sz="6" w:space="2" w:color="BFBFBF"/>
+        </w:pBdr>
+        <w:spacing w:before="280" w:after="120"/>
+      </w:pPr>
+      <w:r>
+        <w:lastRenderedPageBreak/>
+        <w:t>6. Data</w:t>
+      </w:r>
+    </w:p>
+    <w:p>
+      <w:pPr>
+        <w:spacing w:after="120" w:line="276" w:lineRule="auto"/>
+      </w:pPr>
+      <w:r>
+        <w:t>ABIDE is downloaded and processed on my laptop. The figures below are from the processed data, not from published counts.</w:t>
       </w:r>
     </w:p>
     <w:tbl>
@@ -891,7 +1602,7 @@
                 <w:sz w:val="19"/>
                 <w:szCs w:val="19"/>
               </w:rPr>
-              <w:t>Main dataset</w:t>
+              <w:t>Dataset</w:t>
             </w:r>
           </w:p>
         </w:tc>
@@ -917,7 +1628,7 @@
                 <w:sz w:val="19"/>
                 <w:szCs w:val="19"/>
               </w:rPr>
-              <w:t>ABIDE I (Autism Brain Imaging Data Exchange), resting-state fMRI, released through the Preprocessed Connectomes Project (PCP)</w:t>
+              <w:t>ABIDE I, released by the Preprocessed Connectomes Project; open, de-identified, no access agreement</w:t>
             </w:r>
           </w:p>
         </w:tc>
@@ -950,7 +1661,7 @@
                 <w:sz w:val="19"/>
                 <w:szCs w:val="19"/>
               </w:rPr>
-              <w:t>Size</w:t>
+              <w:t>Preprocessing</w:t>
             </w:r>
           </w:p>
         </w:tc>
@@ -976,7 +1687,7 @@
                 <w:sz w:val="19"/>
                 <w:szCs w:val="19"/>
               </w:rPr>
-              <w:t>1,112 subjects scanned at 17 international sites. About 871 pass the standard quality control (403 autism, 468 typical controls), with 20 site labels</w:t>
+              <w:t>C-PAC pipeline, band-pass filtered, no global signal regression</w:t>
             </w:r>
           </w:p>
         </w:tc>
@@ -1009,7 +1720,7 @@
                 <w:sz w:val="19"/>
                 <w:szCs w:val="19"/>
               </w:rPr>
-              <w:t>Access</w:t>
+              <w:t>Subjects</w:t>
             </w:r>
           </w:p>
         </w:tc>
@@ -1035,7 +1746,7 @@
                 <w:sz w:val="19"/>
                 <w:szCs w:val="19"/>
               </w:rPr>
-              <w:t>Open download via nilearn (fetch_abide_pcp) or the PCP S3 bucket; no application, data-use agreement or co-authorship condition</w:t>
+              <w:t>1,112 in the phenotype file; 873 with files and no quality-control failure; 848 after removing scans under 100 timepoints (393 autism, 455 controls, 19 sites)</w:t>
             </w:r>
           </w:p>
         </w:tc>
@@ -1068,7 +1779,7 @@
                 <w:sz w:val="19"/>
                 <w:szCs w:val="19"/>
               </w:rPr>
-              <w:t>Preprocessing</w:t>
+              <w:t>Dropped site</w:t>
             </w:r>
           </w:p>
         </w:tc>
@@ -1094,7 +1805,7 @@
                 <w:sz w:val="19"/>
                 <w:szCs w:val="19"/>
               </w:rPr>
-              <w:t>PCP pipeline (C-PAC), band-pass filtered; ROI time series supplied ready to use, so no raw fMRI processing is needed on my laptop</w:t>
+              <w:t>OHSU (25 subjects, 78 timepoints each); decision on keeping it is open</w:t>
             </w:r>
           </w:p>
         </w:tc>
@@ -1153,7 +1864,7 @@
                 <w:sz w:val="19"/>
                 <w:szCs w:val="19"/>
               </w:rPr>
-              <w:t>Nodes = 200 regions of the CC200 atlas (Craddock 2012); edges = Pearson correlation between region time series, sparsified by k-NN or threshold. AAL (116 regions) used once as a sensitivity check</w:t>
+              <w:t>AAL-116 atlas (main) and CC200 (sensitivity); Pearson correlation, Fisher z; all matrices checked finite and symmetric</w:t>
             </w:r>
           </w:p>
         </w:tc>
@@ -1186,7 +1897,7 @@
                 <w:sz w:val="19"/>
                 <w:szCs w:val="19"/>
               </w:rPr>
-              <w:t>Use in the benchmark</w:t>
+              <w:t>Quality notes</w:t>
             </w:r>
           </w:p>
         </w:tc>
@@ -1212,7 +1923,7 @@
                 <w:sz w:val="19"/>
                 <w:szCs w:val="19"/>
               </w:rPr>
-              <w:t>Only typical controls (~468) are used for planting. They are split at random into fake patients and controls; known edge changes and site decoys are injected, so the true answer is known</w:t>
+              <w:t>54 AAL subjects have up to 12 regions with no signal (mostly SBL and PITT), set to zero; 90 subjects have mean head motion above 0.2 mm (recorded)</w:t>
             </w:r>
           </w:p>
         </w:tc>
@@ -1245,7 +1956,7 @@
                 <w:sz w:val="19"/>
                 <w:szCs w:val="19"/>
               </w:rPr>
-              <w:t>Use with real labels</w:t>
+              <w:t>Use in benchmark</w:t>
             </w:r>
           </w:p>
         </w:tc>
@@ -1271,7 +1982,7 @@
                 <w:sz w:val="19"/>
                 <w:szCs w:val="19"/>
               </w:rPr>
-              <w:t>Full autism vs control set for fallback F3 (real-shortcut audit) and as an optional real-label check of DecoyGuard</w:t>
+              <w:t>Only the 455 controls are used for planting; the full autism vs control set estimates realistic effect sizes and serves as a real-label check</w:t>
             </w:r>
           </w:p>
         </w:tc>
@@ -1304,7 +2015,7 @@
                 <w:sz w:val="19"/>
                 <w:szCs w:val="19"/>
               </w:rPr>
-              <w:t>Site information</w:t>
+              <w:t>Replication</w:t>
             </w:r>
           </w:p>
         </w:tc>
@@ -1330,7 +2041,7 @@
                 <w:sz w:val="19"/>
                 <w:szCs w:val="19"/>
               </w:rPr>
-              <w:t>Scanner site is recorded for every subject. It drives the leave-site-out splits, the site-adversarial head and the decoy design</w:t>
+              <w:t>ADHD-200 preprocessed (open), same pipeline</w:t>
             </w:r>
           </w:p>
         </w:tc>
@@ -1363,7 +2074,7 @@
                 <w:sz w:val="19"/>
                 <w:szCs w:val="19"/>
               </w:rPr>
-              <w:t>Replication dataset</w:t>
+              <w:t>Compute</w:t>
             </w:r>
           </w:p>
         </w:tc>
@@ -1389,7 +2100,7 @@
                 <w:sz w:val="19"/>
                 <w:szCs w:val="19"/>
               </w:rPr>
-              <w:t>ADHD-200 (open, about 970 subjects, 8 sites, same PCP preprocessing); controls used to repeat the benchmark. HCP is the backup if ABIDE fails (fallback F5)</w:t>
+              <w:t>848 graphs of 116 or 200 nodes; runs on an RTX 4060 laptop GPU (8 GB)</w:t>
             </w:r>
           </w:p>
         </w:tc>
@@ -1422,7 +2133,7 @@
                 <w:sz w:val="19"/>
                 <w:szCs w:val="19"/>
               </w:rPr>
-              <w:t>Compute</w:t>
+              <w:t>Ethics</w:t>
             </w:r>
           </w:p>
         </w:tc>
@@ -1448,115 +2159,13 @@
                 <w:sz w:val="19"/>
                 <w:szCs w:val="19"/>
               </w:rPr>
-              <w:t>About 870 graphs × 200 nodes; fits on an RTX 4060 laptop GPU (8 GB)</w:t>
-            </w:r>
-          </w:p>
-        </w:tc>
-      </w:tr>
-      <w:tr>
-        <w:trPr>
-          <w:cantSplit/>
-        </w:trPr>
-        <w:tc>
-          <w:tcPr>
-            <w:tcW w:w="2200" w:type="dxa"/>
-            <w:tcBorders>
-              <w:top w:val="single" w:sz="4" w:space="0" w:color="BFBFBF"/>
-              <w:left w:val="single" w:sz="4" w:space="0" w:color="BFBFBF"/>
-              <w:bottom w:val="single" w:sz="4" w:space="0" w:color="BFBFBF"/>
-              <w:right w:val="single" w:sz="4" w:space="0" w:color="BFBFBF"/>
-            </w:tcBorders>
-            <w:tcMar>
-              <w:top w:w="60" w:type="dxa"/>
-              <w:left w:w="100" w:type="dxa"/>
-              <w:bottom w:w="60" w:type="dxa"/>
-              <w:right w:w="100" w:type="dxa"/>
-            </w:tcMar>
-          </w:tcPr>
-          <w:p>
-            <w:r>
-              <w:rPr>
-                <w:b/>
-                <w:bCs/>
-                <w:sz w:val="19"/>
-                <w:szCs w:val="19"/>
-              </w:rPr>
-              <w:t>Ethics</w:t>
-            </w:r>
-          </w:p>
-        </w:tc>
-        <w:tc>
-          <w:tcPr>
-            <w:tcW w:w="6826" w:type="dxa"/>
-            <w:tcBorders>
-              <w:top w:val="single" w:sz="4" w:space="0" w:color="BFBFBF"/>
-              <w:left w:val="single" w:sz="4" w:space="0" w:color="BFBFBF"/>
-              <w:bottom w:val="single" w:sz="4" w:space="0" w:color="BFBFBF"/>
-              <w:right w:val="single" w:sz="4" w:space="0" w:color="BFBFBF"/>
-            </w:tcBorders>
-            <w:tcMar>
-              <w:top w:w="60" w:type="dxa"/>
-              <w:left w:w="100" w:type="dxa"/>
-              <w:bottom w:w="60" w:type="dxa"/>
-              <w:right w:w="100" w:type="dxa"/>
-            </w:tcMar>
-          </w:tcPr>
-          <w:p>
-            <w:r>
-              <w:rPr>
-                <w:sz w:val="19"/>
-                <w:szCs w:val="19"/>
-              </w:rPr>
-              <w:t>Public, de-identified data released under the consortia's open-sharing terms; I still need to confirm whether Amrita requires an exemption note</w:t>
+              <w:t>Public de-identified data; Amrita exemption requirement still to confirm</w:t>
             </w:r>
           </w:p>
         </w:tc>
       </w:tr>
     </w:tbl>
-    <w:p>
-      <w:pPr>
-        <w:spacing w:after="80"/>
-      </w:pPr>
-    </w:p>
-    <w:p>
-      <w:pPr>
-        <w:spacing w:after="120" w:line="276" w:lineRule="auto"/>
-      </w:pPr>
-      <w:r>
-        <w:rPr>
-          <w:b/>
-          <w:bCs/>
-        </w:rPr>
-        <w:t xml:space="preserve">Note: </w:t>
-      </w:r>
-      <w:r>
-        <w:rPr>
-          <w:i/>
-          <w:iCs/>
-        </w:rPr>
-        <w:t>the subject counts are the commonly reported PCP figures. I will confirm the exact numbers after download and quality control.</w:t>
-      </w:r>
-    </w:p>
-    <w:p>
-      <w:pPr>
-        <w:spacing w:after="120" w:line="276" w:lineRule="auto"/>
-      </w:pPr>
-    </w:p>
-    <w:p>
-      <w:pPr>
-        <w:spacing w:after="120" w:line="276" w:lineRule="auto"/>
-      </w:pPr>
-    </w:p>
-    <w:p>
-      <w:pPr>
-        <w:spacing w:after="120" w:line="276" w:lineRule="auto"/>
-      </w:pPr>
-    </w:p>
-    <w:p>
-      <w:pPr>
-        <w:spacing w:after="120" w:line="276" w:lineRule="auto"/>
-      </w:pPr>
-    </w:p>
+    <w:p/>
     <w:p>
       <w:pPr>
         <w:pStyle w:val="Heading1"/>
@@ -1567,8 +2176,684 @@
         <w:spacing w:before="280" w:after="120"/>
       </w:pPr>
       <w:r>
-        <w:lastRenderedPageBreak/>
-        <w:t>6. Available options</w:t>
+        <w:t>7. Baselines</w:t>
+      </w:r>
+    </w:p>
+    <w:p>
+      <w:pPr>
+        <w:spacing w:after="120" w:line="276" w:lineRule="auto"/>
+      </w:pPr>
+      <w:r>
+        <w:rPr>
+          <w:b/>
+          <w:bCs/>
+        </w:rPr>
+        <w:t xml:space="preserve">Base paper: </w:t>
+      </w:r>
+      <w:r>
+        <w:t xml:space="preserve">BrainIB (Zheng et al., IEEE TNNLS 2025): same task, AAL atlas, ABIDE, public code. </w:t>
+      </w:r>
+      <w:r>
+        <w:rPr>
+          <w:b/>
+          <w:bCs/>
+        </w:rPr>
+        <w:t xml:space="preserve">Evaluation base paper: </w:t>
+      </w:r>
+      <w:r>
+        <w:t>GraphXAI (Agarwal et al., Scientific Data 2023).</w:t>
+      </w:r>
+    </w:p>
+    <w:tbl>
+      <w:tblPr>
+        <w:tblW w:w="9026" w:type="dxa"/>
+        <w:tblBorders>
+          <w:top w:val="single" w:sz="4" w:space="0" w:color="auto"/>
+          <w:left w:val="single" w:sz="4" w:space="0" w:color="auto"/>
+          <w:bottom w:val="single" w:sz="4" w:space="0" w:color="auto"/>
+          <w:right w:val="single" w:sz="4" w:space="0" w:color="auto"/>
+          <w:insideH w:val="single" w:sz="4" w:space="0" w:color="auto"/>
+          <w:insideV w:val="single" w:sz="4" w:space="0" w:color="auto"/>
+        </w:tblBorders>
+        <w:tblCellMar>
+          <w:left w:w="10" w:type="dxa"/>
+          <w:right w:w="10" w:type="dxa"/>
+        </w:tblCellMar>
+        <w:tblLook w:val="0000" w:firstRow="0" w:lastRow="0" w:firstColumn="0" w:lastColumn="0" w:noHBand="0" w:noVBand="0"/>
+      </w:tblPr>
+      <w:tblGrid>
+        <w:gridCol w:w="2300"/>
+        <w:gridCol w:w="3100"/>
+        <w:gridCol w:w="3626"/>
+      </w:tblGrid>
+      <w:tr>
+        <w:trPr>
+          <w:cantSplit/>
+          <w:tblHeader/>
+        </w:trPr>
+        <w:tc>
+          <w:tcPr>
+            <w:tcW w:w="2300" w:type="dxa"/>
+            <w:tcBorders>
+              <w:top w:val="single" w:sz="4" w:space="0" w:color="BFBFBF"/>
+              <w:left w:val="single" w:sz="4" w:space="0" w:color="BFBFBF"/>
+              <w:bottom w:val="single" w:sz="4" w:space="0" w:color="BFBFBF"/>
+              <w:right w:val="single" w:sz="4" w:space="0" w:color="BFBFBF"/>
+            </w:tcBorders>
+            <w:shd w:val="clear" w:color="auto" w:fill="DCE6F1"/>
+            <w:tcMar>
+              <w:top w:w="60" w:type="dxa"/>
+              <w:left w:w="100" w:type="dxa"/>
+              <w:bottom w:w="60" w:type="dxa"/>
+              <w:right w:w="100" w:type="dxa"/>
+            </w:tcMar>
+          </w:tcPr>
+          <w:p>
+            <w:r>
+              <w:rPr>
+                <w:b/>
+                <w:bCs/>
+                <w:sz w:val="19"/>
+                <w:szCs w:val="19"/>
+              </w:rPr>
+              <w:t>Role</w:t>
+            </w:r>
+          </w:p>
+        </w:tc>
+        <w:tc>
+          <w:tcPr>
+            <w:tcW w:w="3100" w:type="dxa"/>
+            <w:tcBorders>
+              <w:top w:val="single" w:sz="4" w:space="0" w:color="BFBFBF"/>
+              <w:left w:val="single" w:sz="4" w:space="0" w:color="BFBFBF"/>
+              <w:bottom w:val="single" w:sz="4" w:space="0" w:color="BFBFBF"/>
+              <w:right w:val="single" w:sz="4" w:space="0" w:color="BFBFBF"/>
+            </w:tcBorders>
+            <w:shd w:val="clear" w:color="auto" w:fill="DCE6F1"/>
+            <w:tcMar>
+              <w:top w:w="60" w:type="dxa"/>
+              <w:left w:w="100" w:type="dxa"/>
+              <w:bottom w:w="60" w:type="dxa"/>
+              <w:right w:w="100" w:type="dxa"/>
+            </w:tcMar>
+          </w:tcPr>
+          <w:p>
+            <w:r>
+              <w:rPr>
+                <w:b/>
+                <w:bCs/>
+                <w:sz w:val="19"/>
+                <w:szCs w:val="19"/>
+              </w:rPr>
+              <w:t>Methods</w:t>
+            </w:r>
+          </w:p>
+        </w:tc>
+        <w:tc>
+          <w:tcPr>
+            <w:tcW w:w="3626" w:type="dxa"/>
+            <w:tcBorders>
+              <w:top w:val="single" w:sz="4" w:space="0" w:color="BFBFBF"/>
+              <w:left w:val="single" w:sz="4" w:space="0" w:color="BFBFBF"/>
+              <w:bottom w:val="single" w:sz="4" w:space="0" w:color="BFBFBF"/>
+              <w:right w:val="single" w:sz="4" w:space="0" w:color="BFBFBF"/>
+            </w:tcBorders>
+            <w:shd w:val="clear" w:color="auto" w:fill="DCE6F1"/>
+            <w:tcMar>
+              <w:top w:w="60" w:type="dxa"/>
+              <w:left w:w="100" w:type="dxa"/>
+              <w:bottom w:w="60" w:type="dxa"/>
+              <w:right w:w="100" w:type="dxa"/>
+            </w:tcMar>
+          </w:tcPr>
+          <w:p>
+            <w:r>
+              <w:rPr>
+                <w:b/>
+                <w:bCs/>
+                <w:sz w:val="19"/>
+                <w:szCs w:val="19"/>
+              </w:rPr>
+              <w:t>Why</w:t>
+            </w:r>
+          </w:p>
+        </w:tc>
+      </w:tr>
+      <w:tr>
+        <w:trPr>
+          <w:cantSplit/>
+        </w:trPr>
+        <w:tc>
+          <w:tcPr>
+            <w:tcW w:w="2300" w:type="dxa"/>
+            <w:tcBorders>
+              <w:top w:val="single" w:sz="4" w:space="0" w:color="BFBFBF"/>
+              <w:left w:val="single" w:sz="4" w:space="0" w:color="BFBFBF"/>
+              <w:bottom w:val="single" w:sz="4" w:space="0" w:color="BFBFBF"/>
+              <w:right w:val="single" w:sz="4" w:space="0" w:color="BFBFBF"/>
+            </w:tcBorders>
+            <w:tcMar>
+              <w:top w:w="60" w:type="dxa"/>
+              <w:left w:w="100" w:type="dxa"/>
+              <w:bottom w:w="60" w:type="dxa"/>
+              <w:right w:w="100" w:type="dxa"/>
+            </w:tcMar>
+          </w:tcPr>
+          <w:p>
+            <w:r>
+              <w:rPr>
+                <w:b/>
+                <w:bCs/>
+                <w:sz w:val="19"/>
+                <w:szCs w:val="19"/>
+              </w:rPr>
+              <w:t>Non-graph models</w:t>
+            </w:r>
+          </w:p>
+        </w:tc>
+        <w:tc>
+          <w:tcPr>
+            <w:tcW w:w="3100" w:type="dxa"/>
+            <w:tcBorders>
+              <w:top w:val="single" w:sz="4" w:space="0" w:color="BFBFBF"/>
+              <w:left w:val="single" w:sz="4" w:space="0" w:color="BFBFBF"/>
+              <w:bottom w:val="single" w:sz="4" w:space="0" w:color="BFBFBF"/>
+              <w:right w:val="single" w:sz="4" w:space="0" w:color="BFBFBF"/>
+            </w:tcBorders>
+            <w:tcMar>
+              <w:top w:w="60" w:type="dxa"/>
+              <w:left w:w="100" w:type="dxa"/>
+              <w:bottom w:w="60" w:type="dxa"/>
+              <w:right w:w="100" w:type="dxa"/>
+            </w:tcMar>
+          </w:tcPr>
+          <w:p>
+            <w:r>
+              <w:rPr>
+                <w:sz w:val="19"/>
+                <w:szCs w:val="19"/>
+              </w:rPr>
+              <w:t>Logistic regression, random forest, MLP</w:t>
+            </w:r>
+          </w:p>
+        </w:tc>
+        <w:tc>
+          <w:tcPr>
+            <w:tcW w:w="3626" w:type="dxa"/>
+            <w:tcBorders>
+              <w:top w:val="single" w:sz="4" w:space="0" w:color="BFBFBF"/>
+              <w:left w:val="single" w:sz="4" w:space="0" w:color="BFBFBF"/>
+              <w:bottom w:val="single" w:sz="4" w:space="0" w:color="BFBFBF"/>
+              <w:right w:val="single" w:sz="4" w:space="0" w:color="BFBFBF"/>
+            </w:tcBorders>
+            <w:tcMar>
+              <w:top w:w="60" w:type="dxa"/>
+              <w:left w:w="100" w:type="dxa"/>
+              <w:bottom w:w="60" w:type="dxa"/>
+              <w:right w:w="100" w:type="dxa"/>
+            </w:tcMar>
+          </w:tcPr>
+          <w:p>
+            <w:r>
+              <w:rPr>
+                <w:sz w:val="19"/>
+                <w:szCs w:val="19"/>
+              </w:rPr>
+              <w:t>Often match GNNs on connectomes (Han 2026)</w:t>
+            </w:r>
+          </w:p>
+        </w:tc>
+      </w:tr>
+      <w:tr>
+        <w:trPr>
+          <w:cantSplit/>
+        </w:trPr>
+        <w:tc>
+          <w:tcPr>
+            <w:tcW w:w="2300" w:type="dxa"/>
+            <w:tcBorders>
+              <w:top w:val="single" w:sz="4" w:space="0" w:color="BFBFBF"/>
+              <w:left w:val="single" w:sz="4" w:space="0" w:color="BFBFBF"/>
+              <w:bottom w:val="single" w:sz="4" w:space="0" w:color="BFBFBF"/>
+              <w:right w:val="single" w:sz="4" w:space="0" w:color="BFBFBF"/>
+            </w:tcBorders>
+            <w:tcMar>
+              <w:top w:w="60" w:type="dxa"/>
+              <w:left w:w="100" w:type="dxa"/>
+              <w:bottom w:w="60" w:type="dxa"/>
+              <w:right w:w="100" w:type="dxa"/>
+            </w:tcMar>
+          </w:tcPr>
+          <w:p>
+            <w:r>
+              <w:rPr>
+                <w:b/>
+                <w:bCs/>
+                <w:sz w:val="19"/>
+                <w:szCs w:val="19"/>
+              </w:rPr>
+              <w:t>Standard GNNs</w:t>
+            </w:r>
+          </w:p>
+        </w:tc>
+        <w:tc>
+          <w:tcPr>
+            <w:tcW w:w="3100" w:type="dxa"/>
+            <w:tcBorders>
+              <w:top w:val="single" w:sz="4" w:space="0" w:color="BFBFBF"/>
+              <w:left w:val="single" w:sz="4" w:space="0" w:color="BFBFBF"/>
+              <w:bottom w:val="single" w:sz="4" w:space="0" w:color="BFBFBF"/>
+              <w:right w:val="single" w:sz="4" w:space="0" w:color="BFBFBF"/>
+            </w:tcBorders>
+            <w:tcMar>
+              <w:top w:w="60" w:type="dxa"/>
+              <w:left w:w="100" w:type="dxa"/>
+              <w:bottom w:w="60" w:type="dxa"/>
+              <w:right w:w="100" w:type="dxa"/>
+            </w:tcMar>
+          </w:tcPr>
+          <w:p>
+            <w:r>
+              <w:rPr>
+                <w:sz w:val="19"/>
+                <w:szCs w:val="19"/>
+              </w:rPr>
+              <w:t>GCN, GIN</w:t>
+            </w:r>
+          </w:p>
+        </w:tc>
+        <w:tc>
+          <w:tcPr>
+            <w:tcW w:w="3626" w:type="dxa"/>
+            <w:tcBorders>
+              <w:top w:val="single" w:sz="4" w:space="0" w:color="BFBFBF"/>
+              <w:left w:val="single" w:sz="4" w:space="0" w:color="BFBFBF"/>
+              <w:bottom w:val="single" w:sz="4" w:space="0" w:color="BFBFBF"/>
+              <w:right w:val="single" w:sz="4" w:space="0" w:color="BFBFBF"/>
+            </w:tcBorders>
+            <w:tcMar>
+              <w:top w:w="60" w:type="dxa"/>
+              <w:left w:w="100" w:type="dxa"/>
+              <w:bottom w:w="60" w:type="dxa"/>
+              <w:right w:w="100" w:type="dxa"/>
+            </w:tcMar>
+          </w:tcPr>
+          <w:p>
+            <w:r>
+              <w:rPr>
+                <w:sz w:val="19"/>
+                <w:szCs w:val="19"/>
+              </w:rPr>
+              <w:t>Standard backbones</w:t>
+            </w:r>
+          </w:p>
+        </w:tc>
+      </w:tr>
+      <w:tr>
+        <w:trPr>
+          <w:cantSplit/>
+        </w:trPr>
+        <w:tc>
+          <w:tcPr>
+            <w:tcW w:w="2300" w:type="dxa"/>
+            <w:tcBorders>
+              <w:top w:val="single" w:sz="4" w:space="0" w:color="BFBFBF"/>
+              <w:left w:val="single" w:sz="4" w:space="0" w:color="BFBFBF"/>
+              <w:bottom w:val="single" w:sz="4" w:space="0" w:color="BFBFBF"/>
+              <w:right w:val="single" w:sz="4" w:space="0" w:color="BFBFBF"/>
+            </w:tcBorders>
+            <w:tcMar>
+              <w:top w:w="60" w:type="dxa"/>
+              <w:left w:w="100" w:type="dxa"/>
+              <w:bottom w:w="60" w:type="dxa"/>
+              <w:right w:w="100" w:type="dxa"/>
+            </w:tcMar>
+          </w:tcPr>
+          <w:p>
+            <w:r>
+              <w:rPr>
+                <w:b/>
+                <w:bCs/>
+                <w:sz w:val="19"/>
+                <w:szCs w:val="19"/>
+              </w:rPr>
+              <w:t>Brain GNNs</w:t>
+            </w:r>
+          </w:p>
+        </w:tc>
+        <w:tc>
+          <w:tcPr>
+            <w:tcW w:w="3100" w:type="dxa"/>
+            <w:tcBorders>
+              <w:top w:val="single" w:sz="4" w:space="0" w:color="BFBFBF"/>
+              <w:left w:val="single" w:sz="4" w:space="0" w:color="BFBFBF"/>
+              <w:bottom w:val="single" w:sz="4" w:space="0" w:color="BFBFBF"/>
+              <w:right w:val="single" w:sz="4" w:space="0" w:color="BFBFBF"/>
+            </w:tcBorders>
+            <w:tcMar>
+              <w:top w:w="60" w:type="dxa"/>
+              <w:left w:w="100" w:type="dxa"/>
+              <w:bottom w:w="60" w:type="dxa"/>
+              <w:right w:w="100" w:type="dxa"/>
+            </w:tcMar>
+          </w:tcPr>
+          <w:p>
+            <w:r>
+              <w:rPr>
+                <w:sz w:val="19"/>
+                <w:szCs w:val="19"/>
+              </w:rPr>
+              <w:t>BrainGNN (MedIA 2021), Brain Network Transformer (NeurIPS 2022)</w:t>
+            </w:r>
+          </w:p>
+        </w:tc>
+        <w:tc>
+          <w:tcPr>
+            <w:tcW w:w="3626" w:type="dxa"/>
+            <w:tcBorders>
+              <w:top w:val="single" w:sz="4" w:space="0" w:color="BFBFBF"/>
+              <w:left w:val="single" w:sz="4" w:space="0" w:color="BFBFBF"/>
+              <w:bottom w:val="single" w:sz="4" w:space="0" w:color="BFBFBF"/>
+              <w:right w:val="single" w:sz="4" w:space="0" w:color="BFBFBF"/>
+            </w:tcBorders>
+            <w:tcMar>
+              <w:top w:w="60" w:type="dxa"/>
+              <w:left w:w="100" w:type="dxa"/>
+              <w:bottom w:w="60" w:type="dxa"/>
+              <w:right w:w="100" w:type="dxa"/>
+            </w:tcMar>
+          </w:tcPr>
+          <w:p>
+            <w:r>
+              <w:rPr>
+                <w:sz w:val="19"/>
+                <w:szCs w:val="19"/>
+              </w:rPr>
+              <w:t>Most-used interpretable and attention-based brain models</w:t>
+            </w:r>
+          </w:p>
+        </w:tc>
+      </w:tr>
+      <w:tr>
+        <w:trPr>
+          <w:cantSplit/>
+        </w:trPr>
+        <w:tc>
+          <w:tcPr>
+            <w:tcW w:w="2300" w:type="dxa"/>
+            <w:tcBorders>
+              <w:top w:val="single" w:sz="4" w:space="0" w:color="BFBFBF"/>
+              <w:left w:val="single" w:sz="4" w:space="0" w:color="BFBFBF"/>
+              <w:bottom w:val="single" w:sz="4" w:space="0" w:color="BFBFBF"/>
+              <w:right w:val="single" w:sz="4" w:space="0" w:color="BFBFBF"/>
+            </w:tcBorders>
+            <w:tcMar>
+              <w:top w:w="60" w:type="dxa"/>
+              <w:left w:w="100" w:type="dxa"/>
+              <w:bottom w:w="60" w:type="dxa"/>
+              <w:right w:w="100" w:type="dxa"/>
+            </w:tcMar>
+          </w:tcPr>
+          <w:p>
+            <w:r>
+              <w:rPr>
+                <w:b/>
+                <w:bCs/>
+                <w:sz w:val="19"/>
+                <w:szCs w:val="19"/>
+              </w:rPr>
+              <w:t>Shortcut-robust brain GNNs</w:t>
+            </w:r>
+          </w:p>
+        </w:tc>
+        <w:tc>
+          <w:tcPr>
+            <w:tcW w:w="3100" w:type="dxa"/>
+            <w:tcBorders>
+              <w:top w:val="single" w:sz="4" w:space="0" w:color="BFBFBF"/>
+              <w:left w:val="single" w:sz="4" w:space="0" w:color="BFBFBF"/>
+              <w:bottom w:val="single" w:sz="4" w:space="0" w:color="BFBFBF"/>
+              <w:right w:val="single" w:sz="4" w:space="0" w:color="BFBFBF"/>
+            </w:tcBorders>
+            <w:tcMar>
+              <w:top w:w="60" w:type="dxa"/>
+              <w:left w:w="100" w:type="dxa"/>
+              <w:bottom w:w="60" w:type="dxa"/>
+              <w:right w:w="100" w:type="dxa"/>
+            </w:tcMar>
+          </w:tcPr>
+          <w:p>
+            <w:r>
+              <w:rPr>
+                <w:sz w:val="19"/>
+                <w:szCs w:val="19"/>
+              </w:rPr>
+              <w:t>BrainIB, CI-GNN, BrainOOD</w:t>
+            </w:r>
+          </w:p>
+        </w:tc>
+        <w:tc>
+          <w:tcPr>
+            <w:tcW w:w="3626" w:type="dxa"/>
+            <w:tcBorders>
+              <w:top w:val="single" w:sz="4" w:space="0" w:color="BFBFBF"/>
+              <w:left w:val="single" w:sz="4" w:space="0" w:color="BFBFBF"/>
+              <w:bottom w:val="single" w:sz="4" w:space="0" w:color="BFBFBF"/>
+              <w:right w:val="single" w:sz="4" w:space="0" w:color="BFBFBF"/>
+            </w:tcBorders>
+            <w:tcMar>
+              <w:top w:w="60" w:type="dxa"/>
+              <w:left w:w="100" w:type="dxa"/>
+              <w:bottom w:w="60" w:type="dxa"/>
+              <w:right w:w="100" w:type="dxa"/>
+            </w:tcMar>
+          </w:tcPr>
+          <w:p>
+            <w:r>
+              <w:rPr>
+                <w:sz w:val="19"/>
+                <w:szCs w:val="19"/>
+              </w:rPr>
+              <w:t>Tested against ground truth (C2)</w:t>
+            </w:r>
+          </w:p>
+        </w:tc>
+      </w:tr>
+      <w:tr>
+        <w:trPr>
+          <w:cantSplit/>
+        </w:trPr>
+        <w:tc>
+          <w:tcPr>
+            <w:tcW w:w="2300" w:type="dxa"/>
+            <w:tcBorders>
+              <w:top w:val="single" w:sz="4" w:space="0" w:color="BFBFBF"/>
+              <w:left w:val="single" w:sz="4" w:space="0" w:color="BFBFBF"/>
+              <w:bottom w:val="single" w:sz="4" w:space="0" w:color="BFBFBF"/>
+              <w:right w:val="single" w:sz="4" w:space="0" w:color="BFBFBF"/>
+            </w:tcBorders>
+            <w:tcMar>
+              <w:top w:w="60" w:type="dxa"/>
+              <w:left w:w="100" w:type="dxa"/>
+              <w:bottom w:w="60" w:type="dxa"/>
+              <w:right w:w="100" w:type="dxa"/>
+            </w:tcMar>
+          </w:tcPr>
+          <w:p>
+            <w:r>
+              <w:rPr>
+                <w:b/>
+                <w:bCs/>
+                <w:sz w:val="19"/>
+                <w:szCs w:val="19"/>
+              </w:rPr>
+              <w:t>Explainers</w:t>
+            </w:r>
+          </w:p>
+        </w:tc>
+        <w:tc>
+          <w:tcPr>
+            <w:tcW w:w="3100" w:type="dxa"/>
+            <w:tcBorders>
+              <w:top w:val="single" w:sz="4" w:space="0" w:color="BFBFBF"/>
+              <w:left w:val="single" w:sz="4" w:space="0" w:color="BFBFBF"/>
+              <w:bottom w:val="single" w:sz="4" w:space="0" w:color="BFBFBF"/>
+              <w:right w:val="single" w:sz="4" w:space="0" w:color="BFBFBF"/>
+            </w:tcBorders>
+            <w:tcMar>
+              <w:top w:w="60" w:type="dxa"/>
+              <w:left w:w="100" w:type="dxa"/>
+              <w:bottom w:w="60" w:type="dxa"/>
+              <w:right w:w="100" w:type="dxa"/>
+            </w:tcMar>
+          </w:tcPr>
+          <w:p>
+            <w:r>
+              <w:rPr>
+                <w:sz w:val="19"/>
+                <w:szCs w:val="19"/>
+              </w:rPr>
+              <w:t>Saliency, Integrated Gradients, GNNExplainer, PGExplainer, built-in masks</w:t>
+            </w:r>
+          </w:p>
+        </w:tc>
+        <w:tc>
+          <w:tcPr>
+            <w:tcW w:w="3626" w:type="dxa"/>
+            <w:tcBorders>
+              <w:top w:val="single" w:sz="4" w:space="0" w:color="BFBFBF"/>
+              <w:left w:val="single" w:sz="4" w:space="0" w:color="BFBFBF"/>
+              <w:bottom w:val="single" w:sz="4" w:space="0" w:color="BFBFBF"/>
+              <w:right w:val="single" w:sz="4" w:space="0" w:color="BFBFBF"/>
+            </w:tcBorders>
+            <w:tcMar>
+              <w:top w:w="60" w:type="dxa"/>
+              <w:left w:w="100" w:type="dxa"/>
+              <w:bottom w:w="60" w:type="dxa"/>
+              <w:right w:w="100" w:type="dxa"/>
+            </w:tcMar>
+          </w:tcPr>
+          <w:p>
+            <w:r>
+              <w:rPr>
+                <w:sz w:val="19"/>
+                <w:szCs w:val="19"/>
+              </w:rPr>
+              <w:t>Standard post-hoc and built-in explanations</w:t>
+            </w:r>
+          </w:p>
+        </w:tc>
+      </w:tr>
+      <w:tr>
+        <w:trPr>
+          <w:cantSplit/>
+        </w:trPr>
+        <w:tc>
+          <w:tcPr>
+            <w:tcW w:w="2300" w:type="dxa"/>
+            <w:tcBorders>
+              <w:top w:val="single" w:sz="4" w:space="0" w:color="BFBFBF"/>
+              <w:left w:val="single" w:sz="4" w:space="0" w:color="BFBFBF"/>
+              <w:bottom w:val="single" w:sz="4" w:space="0" w:color="BFBFBF"/>
+              <w:right w:val="single" w:sz="4" w:space="0" w:color="BFBFBF"/>
+            </w:tcBorders>
+            <w:tcMar>
+              <w:top w:w="60" w:type="dxa"/>
+              <w:left w:w="100" w:type="dxa"/>
+              <w:bottom w:w="60" w:type="dxa"/>
+              <w:right w:w="100" w:type="dxa"/>
+            </w:tcMar>
+          </w:tcPr>
+          <w:p>
+            <w:r>
+              <w:rPr>
+                <w:b/>
+                <w:bCs/>
+                <w:sz w:val="19"/>
+                <w:szCs w:val="19"/>
+              </w:rPr>
+              <w:t>SiteSwap comparisons</w:t>
+            </w:r>
+          </w:p>
+        </w:tc>
+        <w:tc>
+          <w:tcPr>
+            <w:tcW w:w="3100" w:type="dxa"/>
+            <w:tcBorders>
+              <w:top w:val="single" w:sz="4" w:space="0" w:color="BFBFBF"/>
+              <w:left w:val="single" w:sz="4" w:space="0" w:color="BFBFBF"/>
+              <w:bottom w:val="single" w:sz="4" w:space="0" w:color="BFBFBF"/>
+              <w:right w:val="single" w:sz="4" w:space="0" w:color="BFBFBF"/>
+            </w:tcBorders>
+            <w:tcMar>
+              <w:top w:w="60" w:type="dxa"/>
+              <w:left w:w="100" w:type="dxa"/>
+              <w:bottom w:w="60" w:type="dxa"/>
+              <w:right w:w="100" w:type="dxa"/>
+            </w:tcMar>
+          </w:tcPr>
+          <w:p>
+            <w:r>
+              <w:rPr>
+                <w:sz w:val="19"/>
+                <w:szCs w:val="19"/>
+              </w:rPr>
+              <w:t>GSAT, CAL, RGDA, ComBat + GCN, site-adversarial training</w:t>
+            </w:r>
+          </w:p>
+        </w:tc>
+        <w:tc>
+          <w:tcPr>
+            <w:tcW w:w="3626" w:type="dxa"/>
+            <w:tcBorders>
+              <w:top w:val="single" w:sz="4" w:space="0" w:color="BFBFBF"/>
+              <w:left w:val="single" w:sz="4" w:space="0" w:color="BFBFBF"/>
+              <w:bottom w:val="single" w:sz="4" w:space="0" w:color="BFBFBF"/>
+              <w:right w:val="single" w:sz="4" w:space="0" w:color="BFBFBF"/>
+            </w:tcBorders>
+            <w:tcMar>
+              <w:top w:w="60" w:type="dxa"/>
+              <w:left w:w="100" w:type="dxa"/>
+              <w:bottom w:w="60" w:type="dxa"/>
+              <w:right w:w="100" w:type="dxa"/>
+            </w:tcMar>
+          </w:tcPr>
+          <w:p>
+            <w:r>
+              <w:rPr>
+                <w:sz w:val="19"/>
+                <w:szCs w:val="19"/>
+              </w:rPr>
+              <w:t>Test whether site swapping is what helps</w:t>
+            </w:r>
+          </w:p>
+        </w:tc>
+      </w:tr>
+    </w:tbl>
+    <w:p/>
+    <w:p>
+      <w:pPr>
+        <w:spacing w:after="120" w:line="276" w:lineRule="auto"/>
+      </w:pPr>
+      <w:r>
+        <w:rPr>
+          <w:i/>
+          <w:iCs/>
+        </w:rPr>
+        <w:t>Code for each baseline is public according to its paper; none has been run yet. A baseline that cannot reproduce its own published accuracy within about 3% will be reported and dropped.</w:t>
+      </w:r>
+    </w:p>
+    <w:p>
+      <w:pPr>
+        <w:pStyle w:val="Heading1"/>
+        <w:keepNext/>
+        <w:pBdr>
+          <w:bottom w:val="single" w:sz="6" w:space="2" w:color="BFBFBF"/>
+        </w:pBdr>
+        <w:spacing w:before="280" w:after="120"/>
+      </w:pPr>
+      <w:r>
+        <w:t>8. Options and fallbacks</w:t>
       </w:r>
     </w:p>
     <w:tbl>
@@ -1711,7 +2996,7 @@
                 <w:sz w:val="19"/>
                 <w:szCs w:val="19"/>
               </w:rPr>
-              <w:t>Risk</w:t>
+              <w:t>Status</w:t>
             </w:r>
           </w:p>
         </w:tc>
@@ -1744,7 +3029,7 @@
                 <w:sz w:val="19"/>
                 <w:szCs w:val="19"/>
               </w:rPr>
-              <w:t>O2 (recommended)</w:t>
+              <w:t>O2</w:t>
             </w:r>
           </w:p>
         </w:tc>
@@ -1770,7 +3055,7 @@
                 <w:sz w:val="19"/>
                 <w:szCs w:val="19"/>
               </w:rPr>
-              <w:t>Benchmark + DecoyGuard</w:t>
+              <w:t>Benchmark + SiteSwap</w:t>
             </w:r>
           </w:p>
         </w:tc>
@@ -1822,14 +3107,7 @@
                 <w:sz w:val="19"/>
                 <w:szCs w:val="19"/>
               </w:rPr>
-              <w:t>Medium: method may not win</w:t>
-            </w:r>
-            <w:r>
-              <w:rPr>
-                <w:sz w:val="19"/>
-                <w:szCs w:val="19"/>
-              </w:rPr>
-              <w:t xml:space="preserve"> over the other baselines</w:t>
+              <w:t>Approved by guide</w:t>
             </w:r>
           </w:p>
         </w:tc>
@@ -1862,6 +3140,7 @@
                 <w:sz w:val="19"/>
                 <w:szCs w:val="19"/>
               </w:rPr>
+              <w:lastRenderedPageBreak/>
               <w:t>O1</w:t>
             </w:r>
           </w:p>
@@ -1940,7 +3219,7 @@
                 <w:sz w:val="19"/>
                 <w:szCs w:val="19"/>
               </w:rPr>
-              <w:t>Low: any result is a finding</w:t>
+              <w:t>Guaranteed fallback</w:t>
             </w:r>
           </w:p>
         </w:tc>
@@ -1999,7 +3278,7 @@
                 <w:sz w:val="19"/>
                 <w:szCs w:val="19"/>
               </w:rPr>
-              <w:t>Method first; benchmark only as its evaluation</w:t>
+              <w:t>Method first, benchmark as evaluation</w:t>
             </w:r>
           </w:p>
         </w:tc>
@@ -2051,7 +3330,7 @@
                 <w:sz w:val="19"/>
                 <w:szCs w:val="19"/>
               </w:rPr>
-              <w:t>High: judged on accuracy vs CIA-GCL, MetaExplainer</w:t>
+              <w:t>Not chosen</w:t>
             </w:r>
           </w:p>
         </w:tc>
@@ -2110,7 +3389,7 @@
                 <w:sz w:val="19"/>
                 <w:szCs w:val="19"/>
               </w:rPr>
-              <w:t>Real ABIDE autism explanations, no planting</w:t>
+              <w:t>Real autism explanations, no planting</w:t>
             </w:r>
           </w:p>
         </w:tc>
@@ -2162,33 +3441,13 @@
                 <w:sz w:val="19"/>
                 <w:szCs w:val="19"/>
               </w:rPr>
-              <w:t>Low, but crowded</w:t>
+              <w:t>Not chosen</w:t>
             </w:r>
           </w:p>
         </w:tc>
       </w:tr>
     </w:tbl>
-    <w:p>
-      <w:pPr>
-        <w:pStyle w:val="Heading1"/>
-        <w:keepNext/>
-        <w:pBdr>
-          <w:bottom w:val="single" w:sz="6" w:space="2" w:color="BFBFBF"/>
-        </w:pBdr>
-        <w:spacing w:before="280" w:after="120"/>
-      </w:pPr>
-      <w:r>
-        <w:t>7. Fallbacks</w:t>
-      </w:r>
-    </w:p>
-    <w:p>
-      <w:pPr>
-        <w:spacing w:after="120" w:line="276" w:lineRule="auto"/>
-      </w:pPr>
-      <w:r>
-        <w:t xml:space="preserve">All fallbacks stay in the same topic and reuse the same data and code. </w:t>
-      </w:r>
-    </w:p>
+    <w:p/>
     <w:tbl>
       <w:tblPr>
         <w:tblW w:w="9026" w:type="dxa"/>
@@ -2358,7 +3617,7 @@
                 <w:sz w:val="19"/>
                 <w:szCs w:val="19"/>
               </w:rPr>
-              <w:t>DecoyGuard does not beat baselines</w:t>
+              <w:t>SiteSwap does not beat baselines</w:t>
             </w:r>
           </w:p>
         </w:tc>
@@ -2384,7 +3643,7 @@
                 <w:sz w:val="19"/>
                 <w:szCs w:val="19"/>
               </w:rPr>
-              <w:t>Publish O1; report DecoyGuard as a tested negative result</w:t>
+              <w:t>Optimise SiteSwap (guide's decision); the benchmark stays publishable</w:t>
             </w:r>
           </w:p>
         </w:tc>
@@ -2443,7 +3702,7 @@
                 <w:sz w:val="19"/>
                 <w:szCs w:val="19"/>
               </w:rPr>
-              <w:t xml:space="preserve">No explainer recovers even a large planted effect </w:t>
+              <w:t>No explainer recovers even a large planted effect</w:t>
             </w:r>
           </w:p>
         </w:tc>
@@ -2469,7 +3728,7 @@
                 <w:sz w:val="19"/>
                 <w:szCs w:val="19"/>
               </w:rPr>
-              <w:t>Explanation trust score: predict per subject whether an explanation is trustworthy from agreement across explainers and seeds</w:t>
+              <w:t>Explanation trust score from agreement across explainers and seeds</w:t>
             </w:r>
           </w:p>
         </w:tc>
@@ -2528,7 +3787,7 @@
                 <w:sz w:val="19"/>
                 <w:szCs w:val="19"/>
               </w:rPr>
-              <w:t>GNNs ignore the decoy, so no shortcut to detect</w:t>
+              <w:t>GNNs ignore the decoy</w:t>
             </w:r>
           </w:p>
         </w:tc>
@@ -2554,7 +3813,7 @@
                 <w:sz w:val="19"/>
                 <w:szCs w:val="19"/>
               </w:rPr>
-              <w:t>Real-shortcut audit: overlap of real autism-model explanations with site-predictive edges</w:t>
+              <w:t>Real-shortcut audit: overlap of real autism explanations with site-predictive edges</w:t>
             </w:r>
           </w:p>
         </w:tc>
@@ -2639,7 +3898,7 @@
                 <w:sz w:val="19"/>
                 <w:szCs w:val="19"/>
               </w:rPr>
-              <w:t>Atlas sensitivity study: explanation agreement across CC200, AAL, Harvard-Oxford and sparsification choices</w:t>
+              <w:t>Atlas and sparsification sensitivity study; cite Beer 2020 and Reynolds 2023 as precedent</w:t>
             </w:r>
           </w:p>
         </w:tc>
@@ -2698,7 +3957,7 @@
                 <w:sz w:val="19"/>
                 <w:szCs w:val="19"/>
               </w:rPr>
-              <w:t>ABIDE-specific problems (few controls after QC, one site dominates)</w:t>
+              <w:t>ABIDE-specific problems</w:t>
             </w:r>
           </w:p>
         </w:tc>
@@ -2724,12 +3983,13 @@
                 <w:sz w:val="19"/>
                 <w:szCs w:val="19"/>
               </w:rPr>
-              <w:t>Move pipeline to ADHD-200 or HCP; add cross-dataset transfer of explanations</w:t>
+              <w:t>Move to ADHD-200 and add cross-dataset transfer</w:t>
             </w:r>
           </w:p>
         </w:tc>
       </w:tr>
     </w:tbl>
+    <w:p/>
     <w:p>
       <w:pPr>
         <w:pStyle w:val="Heading1"/>
@@ -2740,13 +4000,7 @@
         <w:spacing w:before="280" w:after="120"/>
       </w:pPr>
       <w:r>
-        <w:t>8. Points</w:t>
-      </w:r>
-      <w:r>
-        <w:t xml:space="preserve"> I</w:t>
-      </w:r>
-      <w:r>
-        <w:t xml:space="preserve"> need your decision on</w:t>
+        <w:t>9. Work completed</w:t>
       </w:r>
     </w:p>
     <w:p>
@@ -2759,7 +4013,7 @@
         <w:spacing w:after="60" w:line="264" w:lineRule="auto"/>
       </w:pPr>
       <w:r>
-        <w:t>Is O2 acceptable for the dissertation, with O1 as the guaranteed result?</w:t>
+        <w:t>Topic, novelty and literature checks; 11 papers verified in full text; literature list of about 65 peer-reviewed papers, including 2026 work.</w:t>
       </w:r>
     </w:p>
     <w:p>
@@ -2772,7 +4026,7 @@
         <w:spacing w:after="60" w:line="264" w:lineRule="auto"/>
       </w:pPr>
       <w:r>
-        <w:t>Is a benchmark-style contribution enough for an M.Tech, or must a new model be the main result?</w:t>
+        <w:t>Project set up as CXB in the repository, with a separate Python environment (PyTorch with CUDA on the RTX 4060), unit tests and a decisions log.</w:t>
       </w:r>
     </w:p>
     <w:p>
@@ -2785,7 +4039,7 @@
         <w:spacing w:after="60" w:line="264" w:lineRule="auto"/>
       </w:pPr>
       <w:r>
-        <w:t>Is a clinical application chapter needed? If so, is fallback F3 (real autism data) enough?</w:t>
+        <w:t>ABIDE downloaded (873 subjects, both atlases) and connectivity matrices built for 848 subjects.</w:t>
       </w:r>
     </w:p>
     <w:p>
@@ -2798,7 +4052,20 @@
         <w:spacing w:after="60" w:line="264" w:lineRule="auto"/>
       </w:pPr>
       <w:r>
-        <w:t>Does Amrita require an ethics approval or exemption note for open, de-identified data such as ABIDE?</w:t>
+        <w:t>Next step: estimate real effect sizes, write the planting module, and run the first sanity check (GCN, MLP and saliency on one large planted effect).</w:t>
+      </w:r>
+    </w:p>
+    <w:p>
+      <w:pPr>
+        <w:pStyle w:val="Heading1"/>
+        <w:keepNext/>
+        <w:pBdr>
+          <w:bottom w:val="single" w:sz="6" w:space="2" w:color="BFBFBF"/>
+        </w:pBdr>
+        <w:spacing w:before="280" w:after="120"/>
+      </w:pPr>
+      <w:r>
+        <w:t>10. Points I need your decision on</w:t>
       </w:r>
     </w:p>
     <w:p>
@@ -2811,89 +4078,73 @@
         <w:spacing w:after="60" w:line="264" w:lineRule="auto"/>
       </w:pPr>
       <w:r>
-        <w:t>Target venue level: main conference</w:t>
-      </w:r>
-      <w:r>
-        <w:t xml:space="preserve">, </w:t>
-      </w:r>
-      <w:r>
-        <w:t>Any expected deadline?</w:t>
-      </w:r>
-    </w:p>
-    <w:p>
-      <w:pPr>
+        <w:t>OHSU site: drop it (78 timepoints per scan, below my 100-point minimum) or keep it with a lower threshold?</w:t>
+      </w:r>
+    </w:p>
+    <w:p>
+      <w:pPr>
+        <w:pStyle w:val="ListParagraph"/>
+        <w:numPr>
+          <w:ilvl w:val="0"/>
+          <w:numId w:val="3"/>
+        </w:numPr>
         <w:spacing w:after="60" w:line="264" w:lineRule="auto"/>
       </w:pPr>
-    </w:p>
-    <w:p>
-      <w:pPr>
+      <w:r>
+        <w:t>Small sites (CMU 11 subjects, CALTECH 15): exclude them from leave-one-site-out testing, merge them, or reuse BrainOOD's site splits?</w:t>
+      </w:r>
+    </w:p>
+    <w:p>
+      <w:pPr>
+        <w:pStyle w:val="ListParagraph"/>
+        <w:numPr>
+          <w:ilvl w:val="0"/>
+          <w:numId w:val="3"/>
+        </w:numPr>
         <w:spacing w:after="60" w:line="264" w:lineRule="auto"/>
       </w:pPr>
-    </w:p>
-    <w:p>
-      <w:pPr>
+      <w:r>
+        <w:t>Planting: restrict to sites with at least 10 controls (16 sites, 433 controls)?</w:t>
+      </w:r>
+    </w:p>
+    <w:p>
+      <w:pPr>
+        <w:pStyle w:val="ListParagraph"/>
+        <w:numPr>
+          <w:ilvl w:val="0"/>
+          <w:numId w:val="3"/>
+        </w:numPr>
         <w:spacing w:after="60" w:line="264" w:lineRule="auto"/>
       </w:pPr>
-    </w:p>
-    <w:p>
-      <w:pPr>
+      <w:r>
+        <w:t>Regions with no signal in some subjects: keep planted effects away from them, or exclude those subjects from planting?</w:t>
+      </w:r>
+    </w:p>
+    <w:p>
+      <w:pPr>
+        <w:pStyle w:val="ListParagraph"/>
+        <w:numPr>
+          <w:ilvl w:val="0"/>
+          <w:numId w:val="3"/>
+        </w:numPr>
         <w:spacing w:after="60" w:line="264" w:lineRule="auto"/>
       </w:pPr>
-    </w:p>
-    <w:p>
-      <w:pPr>
+      <w:r>
+        <w:t>Does Amrita require an ethics approval or exemption note for open, de-identified data?</w:t>
+      </w:r>
+    </w:p>
+    <w:p>
+      <w:pPr>
+        <w:pStyle w:val="ListParagraph"/>
+        <w:numPr>
+          <w:ilvl w:val="0"/>
+          <w:numId w:val="3"/>
+        </w:numPr>
         <w:spacing w:after="60" w:line="264" w:lineRule="auto"/>
       </w:pPr>
-    </w:p>
-    <w:p>
-      <w:pPr>
-        <w:spacing w:after="60" w:line="264" w:lineRule="auto"/>
-      </w:pPr>
-    </w:p>
-    <w:p>
-      <w:pPr>
-        <w:spacing w:after="60" w:line="264" w:lineRule="auto"/>
-      </w:pPr>
-    </w:p>
-    <w:p>
-      <w:pPr>
-        <w:spacing w:after="60" w:line="264" w:lineRule="auto"/>
-      </w:pPr>
-    </w:p>
-    <w:p>
-      <w:pPr>
-        <w:spacing w:after="60" w:line="264" w:lineRule="auto"/>
-      </w:pPr>
-    </w:p>
-    <w:p>
-      <w:pPr>
-        <w:spacing w:after="60" w:line="264" w:lineRule="auto"/>
-      </w:pPr>
-    </w:p>
-    <w:p>
-      <w:pPr>
-        <w:spacing w:after="60" w:line="264" w:lineRule="auto"/>
-      </w:pPr>
-    </w:p>
-    <w:p>
-      <w:pPr>
-        <w:spacing w:after="60" w:line="264" w:lineRule="auto"/>
-      </w:pPr>
-    </w:p>
-    <w:p>
-      <w:pPr>
-        <w:spacing w:after="60" w:line="264" w:lineRule="auto"/>
-      </w:pPr>
-    </w:p>
-    <w:p>
-      <w:pPr>
-        <w:spacing w:after="60" w:line="264" w:lineRule="auto"/>
-      </w:pPr>
-    </w:p>
-    <w:p>
-      <w:pPr>
-        <w:spacing w:after="60" w:line="264" w:lineRule="auto"/>
-      </w:pPr>
+      <w:r>
+        <w:t>Target venue level and any expected deadline?</w:t>
+      </w:r>
     </w:p>
     <w:p>
       <w:pPr>
@@ -2919,16 +4170,7 @@
           <w:sz w:val="20"/>
           <w:szCs w:val="20"/>
         </w:rPr>
-        <w:t>Earlier base paper</w:t>
-      </w:r>
-      <w:r>
-        <w:rPr>
-          <w:b/>
-          <w:bCs/>
-          <w:sz w:val="20"/>
-          <w:szCs w:val="20"/>
-        </w:rPr>
-        <w:t>s</w:t>
+        <w:t>Earlier base papers</w:t>
       </w:r>
     </w:p>
     <w:p>
@@ -3065,7 +4307,7 @@
     </w:p>
     <w:p>
       <w:pPr>
-        <w:spacing w:before="120" w:after="60"/>
+        <w:spacing w:after="60"/>
       </w:pPr>
       <w:r>
         <w:rPr>
@@ -3074,7 +4316,8 @@
           <w:sz w:val="20"/>
           <w:szCs w:val="20"/>
         </w:rPr>
-        <w:t>Current topic</w:t>
+        <w:lastRenderedPageBreak/>
+        <w:t>Gap and motivation</w:t>
       </w:r>
     </w:p>
     <w:p>
@@ -3091,9 +4334,111 @@
           <w:sz w:val="20"/>
           <w:szCs w:val="20"/>
         </w:rPr>
+        <w:t xml:space="preserve">Chan et al., </w:t>
+      </w:r>
+      <w:hyperlink r:id="rId7" w:history="1">
+        <w:r>
+          <w:rPr>
+            <w:rStyle w:val="Hyperlink"/>
+            <w:sz w:val="20"/>
+            <w:szCs w:val="20"/>
+          </w:rPr>
+          <w:t>Discovering robust biomarkers of psychiatric disorders from rs-fMRI via GNNs: a systematic review</w:t>
+        </w:r>
+      </w:hyperlink>
+      <w:r>
+        <w:rPr>
+          <w:sz w:val="20"/>
+          <w:szCs w:val="20"/>
+        </w:rPr>
+        <w:t>, NeuroImage 319, 2025.</w:t>
+      </w:r>
+    </w:p>
+    <w:p>
+      <w:pPr>
+        <w:pStyle w:val="ListParagraph"/>
+        <w:numPr>
+          <w:ilvl w:val="0"/>
+          <w:numId w:val="4"/>
+        </w:numPr>
+        <w:spacing w:after="60" w:line="264" w:lineRule="auto"/>
+      </w:pPr>
+      <w:r>
+        <w:rPr>
+          <w:sz w:val="20"/>
+          <w:szCs w:val="20"/>
+        </w:rPr>
+        <w:t xml:space="preserve">Han et al., </w:t>
+      </w:r>
+      <w:hyperlink r:id="rId8" w:history="1">
+        <w:r>
+          <w:rPr>
+            <w:rStyle w:val="Hyperlink"/>
+            <w:sz w:val="20"/>
+            <w:szCs w:val="20"/>
+          </w:rPr>
+          <w:t>Rethinking functional brain connectome analysis: do graph deep learning models help?</w:t>
+        </w:r>
+      </w:hyperlink>
+      <w:r>
+        <w:rPr>
+          <w:sz w:val="20"/>
+          <w:szCs w:val="20"/>
+        </w:rPr>
+        <w:t>, npj Artificial Intelligence, 2026.</w:t>
+      </w:r>
+    </w:p>
+    <w:p>
+      <w:pPr>
+        <w:pStyle w:val="ListParagraph"/>
+        <w:numPr>
+          <w:ilvl w:val="0"/>
+          <w:numId w:val="4"/>
+        </w:numPr>
+        <w:spacing w:after="60" w:line="264" w:lineRule="auto"/>
+      </w:pPr>
+      <w:r>
+        <w:rPr>
+          <w:sz w:val="20"/>
+          <w:szCs w:val="20"/>
+        </w:rPr>
+        <w:t xml:space="preserve">Mueller et al., </w:t>
+      </w:r>
+      <w:hyperlink r:id="rId9" w:history="1">
+        <w:r>
+          <w:rPr>
+            <w:rStyle w:val="Hyperlink"/>
+            <w:sz w:val="20"/>
+            <w:szCs w:val="20"/>
+          </w:rPr>
+          <w:t>Are population graphs really as powerful as believed?</w:t>
+        </w:r>
+      </w:hyperlink>
+      <w:r>
+        <w:rPr>
+          <w:sz w:val="20"/>
+          <w:szCs w:val="20"/>
+        </w:rPr>
+        <w:t>, TMLR, 2024.</w:t>
+      </w:r>
+    </w:p>
+    <w:p>
+      <w:pPr>
+        <w:pStyle w:val="ListParagraph"/>
+        <w:numPr>
+          <w:ilvl w:val="0"/>
+          <w:numId w:val="4"/>
+        </w:numPr>
+        <w:spacing w:after="60" w:line="264" w:lineRule="auto"/>
+      </w:pPr>
+      <w:r>
+        <w:rPr>
+          <w:sz w:val="20"/>
+          <w:szCs w:val="20"/>
+        </w:rPr>
         <w:t xml:space="preserve">Agarwal et al., </w:t>
       </w:r>
-      <w:hyperlink r:id="rId7" w:history="1">
+      <w:hyperlink r:id="rId10" w:history="1">
         <w:r>
           <w:rPr>
             <w:rStyle w:val="Hyperlink"/>
@@ -3108,7 +4453,21 @@
           <w:sz w:val="20"/>
           <w:szCs w:val="20"/>
         </w:rPr>
-        <w:t>, Scientific Data, 2022.</w:t>
+        <w:t>, Scientific Data 10, 2023.</w:t>
+      </w:r>
+    </w:p>
+    <w:p>
+      <w:pPr>
+        <w:spacing w:after="60"/>
+      </w:pPr>
+      <w:r>
+        <w:rPr>
+          <w:b/>
+          <w:bCs/>
+          <w:sz w:val="20"/>
+          <w:szCs w:val="20"/>
+        </w:rPr>
+        <w:t>Baselines and closest methods</w:t>
       </w:r>
     </w:p>
     <w:p>
@@ -3125,16 +4484,16 @@
           <w:sz w:val="20"/>
           <w:szCs w:val="20"/>
         </w:rPr>
-        <w:t xml:space="preserve">Cui et al., </w:t>
-      </w:r>
-      <w:hyperlink r:id="rId8" w:history="1">
+        <w:t xml:space="preserve">Zheng et al., </w:t>
+      </w:r>
+      <w:hyperlink r:id="rId11" w:history="1">
         <w:r>
           <w:rPr>
             <w:rStyle w:val="Hyperlink"/>
             <w:sz w:val="20"/>
             <w:szCs w:val="20"/>
           </w:rPr>
-          <w:t>BrainGB: A Benchmark for Brain Network Analysis with GNNs</w:t>
+          <w:t>BrainIB: interpretable brain network-based psychiatric diagnosis with graph information bottleneck</w:t>
         </w:r>
       </w:hyperlink>
       <w:r>
@@ -3142,7 +4501,7 @@
           <w:sz w:val="20"/>
           <w:szCs w:val="20"/>
         </w:rPr>
-        <w:t>, IEEE TMI, 2022.</w:t>
+        <w:t>, IEEE TNNLS 36(7), 2025.</w:t>
       </w:r>
     </w:p>
     <w:p>
@@ -3159,16 +4518,16 @@
           <w:sz w:val="20"/>
           <w:szCs w:val="20"/>
         </w:rPr>
-        <w:t xml:space="preserve">Li et al., </w:t>
-      </w:r>
-      <w:hyperlink r:id="rId9" w:history="1">
+        <w:t xml:space="preserve">Zheng, Yu &amp; Chen, </w:t>
+      </w:r>
+      <w:hyperlink r:id="rId12" w:history="1">
         <w:r>
           <w:rPr>
             <w:rStyle w:val="Hyperlink"/>
             <w:sz w:val="20"/>
             <w:szCs w:val="20"/>
           </w:rPr>
-          <w:t>BrainGNN: Interpretable Brain GNN for fMRI Analysis</w:t>
+          <w:t>CI-GNN: a Granger causality-inspired GNN for interpretable brain network-based psychiatric diagnosis</w:t>
         </w:r>
       </w:hyperlink>
       <w:r>
@@ -3176,7 +4535,7 @@
           <w:sz w:val="20"/>
           <w:szCs w:val="20"/>
         </w:rPr>
-        <w:t>, Medical Image Analysis, 2020.</w:t>
+        <w:t>, Neural Networks 172, 2024.</w:t>
       </w:r>
     </w:p>
     <w:p>
@@ -3193,16 +4552,16 @@
           <w:sz w:val="20"/>
           <w:szCs w:val="20"/>
         </w:rPr>
-        <w:t xml:space="preserve">Zheng et al., </w:t>
-      </w:r>
-      <w:hyperlink r:id="rId10" w:history="1">
+        <w:t xml:space="preserve">Xu et al., </w:t>
+      </w:r>
+      <w:hyperlink r:id="rId13" w:history="1">
         <w:r>
           <w:rPr>
             <w:rStyle w:val="Hyperlink"/>
             <w:sz w:val="20"/>
             <w:szCs w:val="20"/>
           </w:rPr>
-          <w:t>CI-GNN: Granger causality-inspired GNN for interpretable psychiatric diagnosis</w:t>
+          <w:t>BrainOOD: out-of-distribution generalizable brain network analysis</w:t>
         </w:r>
       </w:hyperlink>
       <w:r>
@@ -3210,7 +4569,7 @@
           <w:sz w:val="20"/>
           <w:szCs w:val="20"/>
         </w:rPr>
-        <w:t>, Neural Networks, 2023.</w:t>
+        <w:t>, ICLR, 2025.</w:t>
       </w:r>
     </w:p>
     <w:p>
@@ -3227,9 +4586,77 @@
           <w:sz w:val="20"/>
           <w:szCs w:val="20"/>
         </w:rPr>
+        <w:t xml:space="preserve">Cui et al., </w:t>
+      </w:r>
+      <w:hyperlink r:id="rId14" w:history="1">
+        <w:r>
+          <w:rPr>
+            <w:rStyle w:val="Hyperlink"/>
+            <w:sz w:val="20"/>
+            <w:szCs w:val="20"/>
+          </w:rPr>
+          <w:t>BrainGB: a benchmark for brain network analysis with GNNs</w:t>
+        </w:r>
+      </w:hyperlink>
+      <w:r>
+        <w:rPr>
+          <w:sz w:val="20"/>
+          <w:szCs w:val="20"/>
+        </w:rPr>
+        <w:t>, IEEE TMI 42, 2023.</w:t>
+      </w:r>
+    </w:p>
+    <w:p>
+      <w:pPr>
+        <w:pStyle w:val="ListParagraph"/>
+        <w:numPr>
+          <w:ilvl w:val="0"/>
+          <w:numId w:val="4"/>
+        </w:numPr>
+        <w:spacing w:after="60" w:line="264" w:lineRule="auto"/>
+      </w:pPr>
+      <w:r>
+        <w:rPr>
+          <w:sz w:val="20"/>
+          <w:szCs w:val="20"/>
+        </w:rPr>
+        <w:t>Li et al., BrainGNN: interpretable brain graph neural network for fMRI analysis, Medical Image Analysis 74, 2021.</w:t>
+      </w:r>
+    </w:p>
+    <w:p>
+      <w:pPr>
+        <w:pStyle w:val="ListParagraph"/>
+        <w:numPr>
+          <w:ilvl w:val="0"/>
+          <w:numId w:val="4"/>
+        </w:numPr>
+        <w:spacing w:after="60" w:line="264" w:lineRule="auto"/>
+      </w:pPr>
+      <w:r>
+        <w:rPr>
+          <w:sz w:val="20"/>
+          <w:szCs w:val="20"/>
+        </w:rPr>
+        <w:t>Kan et al., Brain Network Transformer, NeurIPS, 2022.</w:t>
+      </w:r>
+    </w:p>
+    <w:p>
+      <w:pPr>
+        <w:pStyle w:val="ListParagraph"/>
+        <w:numPr>
+          <w:ilvl w:val="0"/>
+          <w:numId w:val="4"/>
+        </w:numPr>
+        <w:spacing w:after="60" w:line="264" w:lineRule="auto"/>
+      </w:pPr>
+      <w:r>
+        <w:rPr>
+          <w:sz w:val="20"/>
+          <w:szCs w:val="20"/>
+        </w:rPr>
         <w:t xml:space="preserve">Qiu et al., </w:t>
       </w:r>
-      <w:hyperlink r:id="rId11" w:history="1">
+      <w:hyperlink r:id="rId15" w:history="1">
         <w:r>
           <w:rPr>
             <w:rStyle w:val="Hyperlink"/>
@@ -3244,7 +4671,7 @@
           <w:sz w:val="20"/>
           <w:szCs w:val="20"/>
         </w:rPr>
-        <w:t>, Medical Image Analysis, 2025.</w:t>
+        <w:t>, Medical Image Analysis 105, 2025.</w:t>
       </w:r>
     </w:p>
     <w:p>
@@ -3256,22 +4683,12 @@
         </w:numPr>
         <w:spacing w:after="60" w:line="264" w:lineRule="auto"/>
       </w:pPr>
-      <w:hyperlink r:id="rId12" w:history="1">
-        <w:r>
-          <w:rPr>
-            <w:rStyle w:val="Hyperlink"/>
-            <w:sz w:val="20"/>
-            <w:szCs w:val="20"/>
-          </w:rPr>
-          <w:t>Causal Invariance-aware Augmentation for Brain Graph Contrastive Learning (CIA-GCL)</w:t>
-        </w:r>
-      </w:hyperlink>
       <w:r>
         <w:rPr>
           <w:sz w:val="20"/>
           <w:szCs w:val="20"/>
         </w:rPr>
-        <w:t>, ICML, 2025.</w:t>
+        <w:t>Miao, Liu &amp; Li, Interpretable and generalizable graph learning via stochastic attention (GSAT), ICML, 2022.</w:t>
       </w:r>
     </w:p>
     <w:p>
@@ -3288,95 +4705,7 @@
           <w:sz w:val="20"/>
           <w:szCs w:val="20"/>
         </w:rPr>
-        <w:t xml:space="preserve">Wu et al., </w:t>
-      </w:r>
-      <w:hyperlink r:id="rId13" w:history="1">
-        <w:r>
-          <w:rPr>
-            <w:rStyle w:val="Hyperlink"/>
-            <w:sz w:val="20"/>
-            <w:szCs w:val="20"/>
-          </w:rPr>
-          <w:t>Discovering Invariant Rationales for GNNs (DIR)</w:t>
-        </w:r>
-      </w:hyperlink>
-      <w:r>
-        <w:rPr>
-          <w:sz w:val="20"/>
-          <w:szCs w:val="20"/>
-        </w:rPr>
-        <w:t>, ICLR, 2022.</w:t>
-      </w:r>
-    </w:p>
-    <w:p>
-      <w:pPr>
-        <w:pStyle w:val="ListParagraph"/>
-        <w:numPr>
-          <w:ilvl w:val="0"/>
-          <w:numId w:val="4"/>
-        </w:numPr>
-        <w:spacing w:after="60" w:line="264" w:lineRule="auto"/>
-      </w:pPr>
-      <w:hyperlink r:id="rId14" w:history="1">
-        <w:r>
-          <w:rPr>
-            <w:rStyle w:val="Hyperlink"/>
-            <w:sz w:val="20"/>
-            <w:szCs w:val="20"/>
-          </w:rPr>
-          <w:t>BAGEL: A Benchmark for Assessing GNN Explanations</w:t>
-        </w:r>
-      </w:hyperlink>
-      <w:r>
-        <w:rPr>
-          <w:sz w:val="20"/>
-          <w:szCs w:val="20"/>
-        </w:rPr>
-        <w:t>, 2024.</w:t>
-      </w:r>
-    </w:p>
-    <w:p>
-      <w:pPr>
-        <w:pStyle w:val="ListParagraph"/>
-        <w:numPr>
-          <w:ilvl w:val="0"/>
-          <w:numId w:val="4"/>
-        </w:numPr>
-        <w:spacing w:after="60" w:line="264" w:lineRule="auto"/>
-      </w:pPr>
-      <w:hyperlink r:id="rId15" w:history="1">
-        <w:r>
-          <w:rPr>
-            <w:rStyle w:val="Hyperlink"/>
-            <w:sz w:val="20"/>
-            <w:szCs w:val="20"/>
-          </w:rPr>
-          <w:t>BrainNNExplainer</w:t>
-        </w:r>
-      </w:hyperlink>
-      <w:r>
-        <w:rPr>
-          <w:sz w:val="20"/>
-          <w:szCs w:val="20"/>
-        </w:rPr>
-        <w:t>, 2021.</w:t>
-      </w:r>
-    </w:p>
-    <w:p>
-      <w:pPr>
-        <w:pStyle w:val="ListParagraph"/>
-        <w:numPr>
-          <w:ilvl w:val="0"/>
-          <w:numId w:val="4"/>
-        </w:numPr>
-        <w:spacing w:after="60" w:line="264" w:lineRule="auto"/>
-      </w:pPr>
-      <w:r>
-        <w:rPr>
-          <w:sz w:val="20"/>
-          <w:szCs w:val="20"/>
-        </w:rPr>
-        <w:t xml:space="preserve">Han et al., </w:t>
+        <w:t xml:space="preserve">Sui et al., </w:t>
       </w:r>
       <w:hyperlink r:id="rId16" w:history="1">
         <w:r>
@@ -3385,7 +4714,7 @@
             <w:sz w:val="20"/>
             <w:szCs w:val="20"/>
           </w:rPr>
-          <w:t>Rethinking Functional Brain Connectome Analysis: Do Graph Deep Learning Models Help?</w:t>
+          <w:t>Causal attention for interpretable and generalizable graph classification (CAL)</w:t>
         </w:r>
       </w:hyperlink>
       <w:r>
@@ -3393,7 +4722,7 @@
           <w:sz w:val="20"/>
           <w:szCs w:val="20"/>
         </w:rPr>
-        <w:t>, arXiv, 2025.</w:t>
+        <w:t>, KDD, 2022.</w:t>
       </w:r>
     </w:p>
     <w:p>
@@ -3410,7 +4739,7 @@
           <w:sz w:val="20"/>
           <w:szCs w:val="20"/>
         </w:rPr>
-        <w:t xml:space="preserve">Mueller et al., </w:t>
+        <w:t xml:space="preserve">Liu et al., </w:t>
       </w:r>
       <w:hyperlink r:id="rId17" w:history="1">
         <w:r>
@@ -3419,7 +4748,7 @@
             <w:sz w:val="20"/>
             <w:szCs w:val="20"/>
           </w:rPr>
-          <w:t>Are Population Graphs Really as Powerful as Believed?</w:t>
+          <w:t>Rationalizing graph neural networks with data augmentation (RGDA)</w:t>
         </w:r>
       </w:hyperlink>
       <w:r>
@@ -3427,7 +4756,21 @@
           <w:sz w:val="20"/>
           <w:szCs w:val="20"/>
         </w:rPr>
-        <w:t>, TMLR, 2024.</w:t>
+        <w:t>, ACM TKDD 18(4), 2024.</w:t>
+      </w:r>
+    </w:p>
+    <w:p>
+      <w:pPr>
+        <w:spacing w:after="60"/>
+      </w:pPr>
+      <w:r>
+        <w:rPr>
+          <w:b/>
+          <w:bCs/>
+          <w:sz w:val="20"/>
+          <w:szCs w:val="20"/>
+        </w:rPr>
+        <w:t>Site effects, planting and evaluation</w:t>
       </w:r>
     </w:p>
     <w:p>
@@ -3439,6 +4782,13 @@
         </w:numPr>
         <w:spacing w:after="60" w:line="264" w:lineRule="auto"/>
       </w:pPr>
+      <w:r>
+        <w:rPr>
+          <w:sz w:val="20"/>
+          <w:szCs w:val="20"/>
+        </w:rPr>
+        <w:t xml:space="preserve">Yu et al., </w:t>
+      </w:r>
       <w:hyperlink r:id="rId18" w:history="1">
         <w:r>
           <w:rPr>
@@ -3446,7 +4796,7 @@
             <w:sz w:val="20"/>
             <w:szCs w:val="20"/>
           </w:rPr>
-          <w:t>Perturb More, Trap More: explainer fidelity vs. accuracy</w:t>
+          <w:t>Statistical harmonization corrects site effects in functional connectivity measurements from multi-site fMRI data</w:t>
         </w:r>
       </w:hyperlink>
       <w:r>
@@ -3454,21 +4804,7 @@
           <w:sz w:val="20"/>
           <w:szCs w:val="20"/>
         </w:rPr>
-        <w:t>, 2020.</w:t>
-      </w:r>
-    </w:p>
-    <w:p>
-      <w:pPr>
-        <w:spacing w:before="120" w:after="60"/>
-      </w:pPr>
-      <w:r>
-        <w:rPr>
-          <w:b/>
-          <w:bCs/>
-          <w:sz w:val="20"/>
-          <w:szCs w:val="20"/>
-        </w:rPr>
-        <w:t>Data and atlas</w:t>
+        <w:t>, Human Brain Mapping 39, 2018.</w:t>
       </w:r>
     </w:p>
     <w:p>
@@ -3485,7 +4821,24 @@
           <w:sz w:val="20"/>
           <w:szCs w:val="20"/>
         </w:rPr>
-        <w:t xml:space="preserve">Di Martino et al., </w:t>
+        <w:t>Beer et al., Longitudinal ComBat: a method for harmonizing longitudinal multi-scanner imaging data, NeuroImage 220, 2020.</w:t>
+      </w:r>
+    </w:p>
+    <w:p>
+      <w:pPr>
+        <w:pStyle w:val="ListParagraph"/>
+        <w:numPr>
+          <w:ilvl w:val="0"/>
+          <w:numId w:val="4"/>
+        </w:numPr>
+        <w:spacing w:after="60" w:line="264" w:lineRule="auto"/>
+      </w:pPr>
+      <w:r>
+        <w:rPr>
+          <w:sz w:val="20"/>
+          <w:szCs w:val="20"/>
+        </w:rPr>
+        <w:t xml:space="preserve">Reynolds et al., </w:t>
       </w:r>
       <w:hyperlink r:id="rId19" w:history="1">
         <w:r>
@@ -3494,7 +4847,7 @@
             <w:sz w:val="20"/>
             <w:szCs w:val="20"/>
           </w:rPr>
-          <w:t>The autism brain imaging data exchange: towards a large-scale evaluation of the intrinsic brain architecture in autism</w:t>
+          <w:t>ComBat harmonization: empirical Bayes versus fully Bayes approaches</w:t>
         </w:r>
       </w:hyperlink>
       <w:r>
@@ -3502,7 +4855,7 @@
           <w:sz w:val="20"/>
           <w:szCs w:val="20"/>
         </w:rPr>
-        <w:t>, Molecular Psychiatry, 2014.</w:t>
+        <w:t>, NeuroImage: Clinical 39, 2023.</w:t>
       </w:r>
     </w:p>
     <w:p>
@@ -3519,24 +4872,7 @@
           <w:sz w:val="20"/>
           <w:szCs w:val="20"/>
         </w:rPr>
-        <w:t xml:space="preserve">Craddock et al., </w:t>
-      </w:r>
-      <w:hyperlink r:id="rId20" w:history="1">
-        <w:r>
-          <w:rPr>
-            <w:rStyle w:val="Hyperlink"/>
-            <w:sz w:val="20"/>
-            <w:szCs w:val="20"/>
-          </w:rPr>
-          <w:t>The Neuro Bureau Preprocessing Initiative: open sharing of preprocessed neuroimaging data and derivatives</w:t>
-        </w:r>
-      </w:hyperlink>
-      <w:r>
-        <w:rPr>
-          <w:sz w:val="20"/>
-          <w:szCs w:val="20"/>
-        </w:rPr>
-        <w:t>, Frontiers in Neuroinformatics, 2013.</w:t>
+        <w:t>Jeon, Systematic validation of graph neural network explanations against adverse outcome pathway reactive centers for skin sensitization, Journal of Cheminformatics, 2026.</w:t>
       </w:r>
     </w:p>
     <w:p>
@@ -3553,24 +4889,21 @@
           <w:sz w:val="20"/>
           <w:szCs w:val="20"/>
         </w:rPr>
-        <w:t xml:space="preserve">Craddock et al., </w:t>
-      </w:r>
-      <w:hyperlink r:id="rId21" w:history="1">
-        <w:r>
-          <w:rPr>
-            <w:rStyle w:val="Hyperlink"/>
-            <w:sz w:val="20"/>
-            <w:szCs w:val="20"/>
-          </w:rPr>
-          <w:t>A whole brain fMRI atlas generated via spatially constrained spectral clustering</w:t>
-        </w:r>
-      </w:hyperlink>
-      <w:r>
-        <w:rPr>
+        <w:t>Kurashkin et al., Evaluation rigor from graph neural networks to graph foundation models: a systematic review and a four-axis reporting standard, Machine Learning and Knowledge Extraction, 2026.</w:t>
+      </w:r>
+    </w:p>
+    <w:p>
+      <w:pPr>
+        <w:spacing w:after="60"/>
+      </w:pPr>
+      <w:r>
+        <w:rPr>
+          <w:b/>
+          <w:bCs/>
           <w:sz w:val="20"/>
           <w:szCs w:val="20"/>
         </w:rPr>
-        <w:t>, Human Brain Mapping, 2012.</w:t>
+        <w:t>Data and atlas</w:t>
       </w:r>
     </w:p>
     <w:p>
@@ -3587,28 +4920,79 @@
           <w:sz w:val="20"/>
           <w:szCs w:val="20"/>
         </w:rPr>
-        <w:t xml:space="preserve">ADHD-200 Consortium, </w:t>
-      </w:r>
-      <w:hyperlink r:id="rId22" w:history="1">
-        <w:r>
-          <w:rPr>
-            <w:rStyle w:val="Hyperlink"/>
-            <w:sz w:val="20"/>
-            <w:szCs w:val="20"/>
-          </w:rPr>
-          <w:t>The ADHD-200 Consortium: a model to advance the translational potential of neuroimaging in clinical neuroscience</w:t>
-        </w:r>
-      </w:hyperlink>
+        <w:t>Di Martino et al., The autism brain imaging data exchange, Molecular Psychiatry 19, 2014.</w:t>
+      </w:r>
+    </w:p>
+    <w:p>
+      <w:pPr>
+        <w:pStyle w:val="ListParagraph"/>
+        <w:numPr>
+          <w:ilvl w:val="0"/>
+          <w:numId w:val="4"/>
+        </w:numPr>
+        <w:spacing w:after="60" w:line="264" w:lineRule="auto"/>
+      </w:pPr>
       <w:r>
         <w:rPr>
           <w:sz w:val="20"/>
           <w:szCs w:val="20"/>
         </w:rPr>
-        <w:t>, Frontiers in Systems Neuroscience, 2012.</w:t>
+        <w:t>Craddock et al., The Neuro Bureau Preprocessing Initiative: open sharing of preprocessed neuroimaging data and derivatives, Frontiers in Neuroinformatics, 2013.</w:t>
+      </w:r>
+    </w:p>
+    <w:p>
+      <w:pPr>
+        <w:pStyle w:val="ListParagraph"/>
+        <w:numPr>
+          <w:ilvl w:val="0"/>
+          <w:numId w:val="4"/>
+        </w:numPr>
+        <w:spacing w:after="60" w:line="264" w:lineRule="auto"/>
+      </w:pPr>
+      <w:r>
+        <w:rPr>
+          <w:sz w:val="20"/>
+          <w:szCs w:val="20"/>
+        </w:rPr>
+        <w:t>Tzourio-Mazoyer et al., Automated anatomical labeling of activations in SPM (AAL atlas), NeuroImage 15, 2002.</w:t>
+      </w:r>
+    </w:p>
+    <w:p>
+      <w:pPr>
+        <w:pStyle w:val="ListParagraph"/>
+        <w:numPr>
+          <w:ilvl w:val="0"/>
+          <w:numId w:val="4"/>
+        </w:numPr>
+        <w:spacing w:after="60" w:line="264" w:lineRule="auto"/>
+      </w:pPr>
+      <w:r>
+        <w:rPr>
+          <w:sz w:val="20"/>
+          <w:szCs w:val="20"/>
+        </w:rPr>
+        <w:t>Craddock et al., A whole brain fMRI atlas generated via spatially constrained spectral clustering (CC200), Human Brain Mapping 33, 2012.</w:t>
+      </w:r>
+    </w:p>
+    <w:p>
+      <w:pPr>
+        <w:pStyle w:val="ListParagraph"/>
+        <w:numPr>
+          <w:ilvl w:val="0"/>
+          <w:numId w:val="4"/>
+        </w:numPr>
+        <w:spacing w:after="60" w:line="264" w:lineRule="auto"/>
+      </w:pPr>
+      <w:r>
+        <w:rPr>
+          <w:sz w:val="20"/>
+          <w:szCs w:val="20"/>
+        </w:rPr>
+        <w:t>ADHD-200 Consortium, The ADHD-200 Consortium: a model to advance the translational potential of neuroimaging in clinical neuroscience, Frontiers in Systems Neuroscience 6, 2012.</w:t>
       </w:r>
     </w:p>
     <w:sectPr>
-      <w:footerReference w:type="default" r:id="rId23"/>
+      <w:footerReference w:type="default" r:id="rId20"/>
       <w:pgSz w:w="11906" w:h="16838"/>
       <w:pgMar w:top="1200" w:right="1440" w:bottom="1200" w:left="1440" w:header="708" w:footer="708" w:gutter="0"/>
       <w:cols w:space="720"/>

</xml_diff>